<commit_message>
Switch to 2-column x 3-row grid layout matching original format
</commit_message>
<xml_diff>
--- a/PHYS1-SC2-Questionnaires.docx
+++ b/PHYS1-SC2-Questionnaires.docx
@@ -8,6 +8,7 @@
         <w:jc w:val="center"/>
         <w:tblLook w:firstColumn="1" w:firstRow="1" w:lastColumn="0" w:lastRow="0" w:noHBand="0" w:noVBand="1" w:val="04A0"/>
         <w:tblW w:w="5000" w:type="pct"/>
+        <w:tblLayout w:type="fixed"/>
         <w:tblBorders>
           <w:top w:val="single" w:sz="12" w:space="0" w:color="000000"/>
           <w:left w:val="single" w:sz="12" w:space="0" w:color="000000"/>
@@ -18,12 +19,13 @@
         </w:tblBorders>
       </w:tblPr>
       <w:tblGrid>
-        <w:gridCol w:w="11674"/>
+        <w:gridCol w:w="5760"/>
+        <w:gridCol w:w="5760"/>
       </w:tblGrid>
       <w:tr>
         <w:tc>
           <w:tcPr>
-            <w:tcW w:type="dxa" w:w="11674"/>
+            <w:tcW w:type="dxa" w:w="5760"/>
             <w:tcMar>
               <w:top w:w="80" w:type="dxa"/>
               <w:bottom w:w="80" w:type="dxa"/>
@@ -116,11 +118,9 @@
             </w:r>
           </w:p>
         </w:tc>
-      </w:tr>
-      <w:tr>
         <w:tc>
           <w:tcPr>
-            <w:tcW w:type="dxa" w:w="11674"/>
+            <w:tcW w:type="dxa" w:w="5760"/>
             <w:tcMar>
               <w:top w:w="80" w:type="dxa"/>
               <w:bottom w:w="80" w:type="dxa"/>
@@ -217,7 +217,7 @@
       <w:tr>
         <w:tc>
           <w:tcPr>
-            <w:tcW w:type="dxa" w:w="11674"/>
+            <w:tcW w:type="dxa" w:w="5760"/>
             <w:tcMar>
               <w:top w:w="80" w:type="dxa"/>
               <w:bottom w:w="80" w:type="dxa"/>
@@ -310,11 +310,9 @@
             </w:r>
           </w:p>
         </w:tc>
-      </w:tr>
-      <w:tr>
         <w:tc>
           <w:tcPr>
-            <w:tcW w:type="dxa" w:w="11674"/>
+            <w:tcW w:type="dxa" w:w="5760"/>
             <w:tcMar>
               <w:top w:w="80" w:type="dxa"/>
               <w:bottom w:w="80" w:type="dxa"/>
@@ -333,6 +331,198 @@
                 <w:sz w:val="20"/>
               </w:rPr>
               <w:t>Questionnaire No. PHYS1-SC2-04</w:t>
+            </w:r>
+          </w:p>
+          <w:p>
+            <w:pPr>
+              <w:spacing w:before="0" w:after="0"/>
+              <w:jc w:val="center"/>
+            </w:pPr>
+            <w:r>
+              <w:rPr>
+                <w:rFonts w:ascii="Times New Roman" w:hAnsi="Times New Roman"/>
+                <w:b/>
+                <w:sz w:val="20"/>
+              </w:rPr>
+              <w:t>SKILL CHECK 2</w:t>
+            </w:r>
+          </w:p>
+          <w:p>
+            <w:pPr>
+              <w:spacing w:before="0" w:after="120"/>
+              <w:jc w:val="center"/>
+            </w:pPr>
+            <w:r>
+              <w:rPr>
+                <w:rFonts w:ascii="Times New Roman" w:hAnsi="Times New Roman"/>
+                <w:sz w:val="20"/>
+              </w:rPr>
+              <w:t>Physics 1</w:t>
+            </w:r>
+          </w:p>
+          <w:p>
+            <w:pPr>
+              <w:spacing w:before="0" w:after="120"/>
+            </w:pPr>
+            <w:r>
+              <w:rPr>
+                <w:rFonts w:ascii="Times New Roman" w:hAnsi="Times New Roman"/>
+                <w:b/>
+                <w:sz w:val="20"/>
+              </w:rPr>
+              <w:t>Instructions:</w:t>
+            </w:r>
+            <w:r>
+              <w:rPr>
+                <w:rFonts w:ascii="Times New Roman" w:hAnsi="Times New Roman"/>
+                <w:sz w:val="20"/>
+              </w:rPr>
+              <w:t xml:space="preserve"> Do not write anything on this paper. Solve the problems using the Given-Required-Solution format. Show the isolation of the target variable before substituting any numerical values.</w:t>
+            </w:r>
+          </w:p>
+          <w:p>
+            <w:pPr>
+              <w:spacing w:before="0" w:after="120"/>
+            </w:pPr>
+            <w:r>
+              <w:rPr>
+                <w:rFonts w:ascii="Times New Roman" w:hAnsi="Times New Roman"/>
+                <w:sz w:val="20"/>
+              </w:rPr>
+              <w:t>1) A jet plane is cruising at 280 m/s when suddenly the pilot turns the engines to full throttle. After traveling 4.0 km, the jet moves with a speed of 380 m/s. What is the jet’s acceleration, assuming it to be a constant acceleration? [5 pts]</w:t>
+            </w:r>
+          </w:p>
+          <w:p>
+            <w:pPr>
+              <w:spacing w:before="0" w:after="0"/>
+            </w:pPr>
+            <w:r>
+              <w:rPr>
+                <w:rFonts w:ascii="Times New Roman" w:hAnsi="Times New Roman"/>
+                <w:sz w:val="20"/>
+              </w:rPr>
+              <w:t>2) How long, in seconds, does it take for the air in your lungs to accelerate from rest to 150 km/h, assuming a constant acceleration of 83 m/s²? [5 pts]</w:t>
+            </w:r>
+          </w:p>
+        </w:tc>
+      </w:tr>
+      <w:tr>
+        <w:tc>
+          <w:tcPr>
+            <w:tcW w:type="dxa" w:w="5760"/>
+            <w:tcMar>
+              <w:top w:w="80" w:type="dxa"/>
+              <w:bottom w:w="80" w:type="dxa"/>
+              <w:start w:w="120" w:type="dxa"/>
+              <w:end w:w="120" w:type="dxa"/>
+            </w:tcMar>
+          </w:tcPr>
+          <w:p>
+            <w:pPr>
+              <w:spacing w:before="0" w:after="0"/>
+              <w:jc w:val="right"/>
+            </w:pPr>
+            <w:r>
+              <w:rPr>
+                <w:rFonts w:ascii="Times New Roman" w:hAnsi="Times New Roman"/>
+                <w:sz w:val="20"/>
+              </w:rPr>
+              <w:t>Questionnaire No. PHYS1-SC2-05</w:t>
+            </w:r>
+          </w:p>
+          <w:p>
+            <w:pPr>
+              <w:spacing w:before="0" w:after="0"/>
+              <w:jc w:val="center"/>
+            </w:pPr>
+            <w:r>
+              <w:rPr>
+                <w:rFonts w:ascii="Times New Roman" w:hAnsi="Times New Roman"/>
+                <w:b/>
+                <w:sz w:val="20"/>
+              </w:rPr>
+              <w:t>SKILL CHECK 2</w:t>
+            </w:r>
+          </w:p>
+          <w:p>
+            <w:pPr>
+              <w:spacing w:before="0" w:after="120"/>
+              <w:jc w:val="center"/>
+            </w:pPr>
+            <w:r>
+              <w:rPr>
+                <w:rFonts w:ascii="Times New Roman" w:hAnsi="Times New Roman"/>
+                <w:sz w:val="20"/>
+              </w:rPr>
+              <w:t>Physics 1</w:t>
+            </w:r>
+          </w:p>
+          <w:p>
+            <w:pPr>
+              <w:spacing w:before="0" w:after="120"/>
+            </w:pPr>
+            <w:r>
+              <w:rPr>
+                <w:rFonts w:ascii="Times New Roman" w:hAnsi="Times New Roman"/>
+                <w:b/>
+                <w:sz w:val="20"/>
+              </w:rPr>
+              <w:t>Instructions:</w:t>
+            </w:r>
+            <w:r>
+              <w:rPr>
+                <w:rFonts w:ascii="Times New Roman" w:hAnsi="Times New Roman"/>
+                <w:sz w:val="20"/>
+              </w:rPr>
+              <w:t xml:space="preserve"> Do not write anything on this paper. Solve the problems using the Given-Required-Solution format. Show the isolation of the target variable before substituting any numerical values.</w:t>
+            </w:r>
+          </w:p>
+          <w:p>
+            <w:pPr>
+              <w:spacing w:before="0" w:after="120"/>
+            </w:pPr>
+            <w:r>
+              <w:rPr>
+                <w:rFonts w:ascii="Times New Roman" w:hAnsi="Times New Roman"/>
+                <w:sz w:val="20"/>
+              </w:rPr>
+              <w:t>1) A jet plane is cruising at 280 m/s when suddenly the pilot turns the engines to full throttle. After traveling 4.0 km, the jet moves with a speed of 380 m/s. What is the jet’s acceleration, assuming it to be a constant acceleration? [5 pts]</w:t>
+            </w:r>
+          </w:p>
+          <w:p>
+            <w:pPr>
+              <w:spacing w:before="0" w:after="0"/>
+            </w:pPr>
+            <w:r>
+              <w:rPr>
+                <w:rFonts w:ascii="Times New Roman" w:hAnsi="Times New Roman"/>
+                <w:sz w:val="20"/>
+              </w:rPr>
+              <w:t>2) How long, in seconds, does it take for the air in your lungs to accelerate from rest to 150 km/h, assuming a constant acceleration of 83 m/s²? [5 pts]</w:t>
+            </w:r>
+          </w:p>
+        </w:tc>
+        <w:tc>
+          <w:tcPr>
+            <w:tcW w:type="dxa" w:w="5760"/>
+            <w:tcMar>
+              <w:top w:w="80" w:type="dxa"/>
+              <w:bottom w:w="80" w:type="dxa"/>
+              <w:start w:w="120" w:type="dxa"/>
+              <w:end w:w="120" w:type="dxa"/>
+            </w:tcMar>
+          </w:tcPr>
+          <w:p>
+            <w:pPr>
+              <w:spacing w:before="0" w:after="0"/>
+              <w:jc w:val="right"/>
+            </w:pPr>
+            <w:r>
+              <w:rPr>
+                <w:rFonts w:ascii="Times New Roman" w:hAnsi="Times New Roman"/>
+                <w:sz w:val="20"/>
+              </w:rPr>
+              <w:t>Questionnaire No. PHYS1-SC2-06</w:t>
             </w:r>
           </w:p>
           <w:p>
@@ -423,6 +613,7 @@
         <w:jc w:val="center"/>
         <w:tblLook w:firstColumn="1" w:firstRow="1" w:lastColumn="0" w:lastRow="0" w:noHBand="0" w:noVBand="1" w:val="04A0"/>
         <w:tblW w:w="5000" w:type="pct"/>
+        <w:tblLayout w:type="fixed"/>
         <w:tblBorders>
           <w:top w:val="single" w:sz="12" w:space="0" w:color="000000"/>
           <w:left w:val="single" w:sz="12" w:space="0" w:color="000000"/>
@@ -433,12 +624,13 @@
         </w:tblBorders>
       </w:tblPr>
       <w:tblGrid>
-        <w:gridCol w:w="11674"/>
+        <w:gridCol w:w="5760"/>
+        <w:gridCol w:w="5760"/>
       </w:tblGrid>
       <w:tr>
         <w:tc>
           <w:tcPr>
-            <w:tcW w:type="dxa" w:w="11674"/>
+            <w:tcW w:type="dxa" w:w="5760"/>
             <w:tcMar>
               <w:top w:w="80" w:type="dxa"/>
               <w:bottom w:w="80" w:type="dxa"/>
@@ -456,7 +648,7 @@
                 <w:rFonts w:ascii="Times New Roman" w:hAnsi="Times New Roman"/>
                 <w:sz w:val="20"/>
               </w:rPr>
-              <w:t>Questionnaire No. PHYS1-SC2-05</w:t>
+              <w:t>Questionnaire No. PHYS1-SC2-07</w:t>
             </w:r>
           </w:p>
           <w:p>
@@ -531,11 +723,9 @@
             </w:r>
           </w:p>
         </w:tc>
-      </w:tr>
-      <w:tr>
         <w:tc>
           <w:tcPr>
-            <w:tcW w:type="dxa" w:w="11674"/>
+            <w:tcW w:type="dxa" w:w="5760"/>
             <w:tcMar>
               <w:top w:w="80" w:type="dxa"/>
               <w:bottom w:w="80" w:type="dxa"/>
@@ -553,7 +743,7 @@
                 <w:rFonts w:ascii="Times New Roman" w:hAnsi="Times New Roman"/>
                 <w:sz w:val="20"/>
               </w:rPr>
-              <w:t>Questionnaire No. PHYS1-SC2-06</w:t>
+              <w:t>Questionnaire No. PHYS1-SC2-08</w:t>
             </w:r>
           </w:p>
           <w:p>
@@ -632,7 +822,7 @@
       <w:tr>
         <w:tc>
           <w:tcPr>
-            <w:tcW w:type="dxa" w:w="11674"/>
+            <w:tcW w:type="dxa" w:w="5760"/>
             <w:tcMar>
               <w:top w:w="80" w:type="dxa"/>
               <w:bottom w:w="80" w:type="dxa"/>
@@ -650,7 +840,7 @@
                 <w:rFonts w:ascii="Times New Roman" w:hAnsi="Times New Roman"/>
                 <w:sz w:val="20"/>
               </w:rPr>
-              <w:t>Questionnaire No. PHYS1-SC2-07</w:t>
+              <w:t>Questionnaire No. PHYS1-SC2-09</w:t>
             </w:r>
           </w:p>
           <w:p>
@@ -725,11 +915,9 @@
             </w:r>
           </w:p>
         </w:tc>
-      </w:tr>
-      <w:tr>
         <w:tc>
           <w:tcPr>
-            <w:tcW w:type="dxa" w:w="11674"/>
+            <w:tcW w:type="dxa" w:w="5760"/>
             <w:tcMar>
               <w:top w:w="80" w:type="dxa"/>
               <w:bottom w:w="80" w:type="dxa"/>
@@ -747,7 +935,199 @@
                 <w:rFonts w:ascii="Times New Roman" w:hAnsi="Times New Roman"/>
                 <w:sz w:val="20"/>
               </w:rPr>
-              <w:t>Questionnaire No. PHYS1-SC2-08</w:t>
+              <w:t>Questionnaire No. PHYS1-SC2-10</w:t>
+            </w:r>
+          </w:p>
+          <w:p>
+            <w:pPr>
+              <w:spacing w:before="0" w:after="0"/>
+              <w:jc w:val="center"/>
+            </w:pPr>
+            <w:r>
+              <w:rPr>
+                <w:rFonts w:ascii="Times New Roman" w:hAnsi="Times New Roman"/>
+                <w:b/>
+                <w:sz w:val="20"/>
+              </w:rPr>
+              <w:t>SKILL CHECK 2</w:t>
+            </w:r>
+          </w:p>
+          <w:p>
+            <w:pPr>
+              <w:spacing w:before="0" w:after="120"/>
+              <w:jc w:val="center"/>
+            </w:pPr>
+            <w:r>
+              <w:rPr>
+                <w:rFonts w:ascii="Times New Roman" w:hAnsi="Times New Roman"/>
+                <w:sz w:val="20"/>
+              </w:rPr>
+              <w:t>Physics 1</w:t>
+            </w:r>
+          </w:p>
+          <w:p>
+            <w:pPr>
+              <w:spacing w:before="0" w:after="120"/>
+            </w:pPr>
+            <w:r>
+              <w:rPr>
+                <w:rFonts w:ascii="Times New Roman" w:hAnsi="Times New Roman"/>
+                <w:b/>
+                <w:sz w:val="20"/>
+              </w:rPr>
+              <w:t>Instructions:</w:t>
+            </w:r>
+            <w:r>
+              <w:rPr>
+                <w:rFonts w:ascii="Times New Roman" w:hAnsi="Times New Roman"/>
+                <w:sz w:val="20"/>
+              </w:rPr>
+              <w:t xml:space="preserve"> Do not write anything on this paper. Solve the problems using the Given-Required-Solution format. Show the isolation of the target variable before substituting any numerical values.</w:t>
+            </w:r>
+          </w:p>
+          <w:p>
+            <w:pPr>
+              <w:spacing w:before="0" w:after="120"/>
+            </w:pPr>
+            <w:r>
+              <w:rPr>
+                <w:rFonts w:ascii="Times New Roman" w:hAnsi="Times New Roman"/>
+                <w:sz w:val="20"/>
+              </w:rPr>
+              <w:t>1) A jet plane is cruising at 280 m/s when suddenly the pilot turns the engines to full throttle. After traveling 4.0 km, the jet moves with a speed of 380 m/s. What is the jet’s acceleration, assuming it to be a constant acceleration? [5 pts]</w:t>
+            </w:r>
+          </w:p>
+          <w:p>
+            <w:pPr>
+              <w:spacing w:before="0" w:after="0"/>
+            </w:pPr>
+            <w:r>
+              <w:rPr>
+                <w:rFonts w:ascii="Times New Roman" w:hAnsi="Times New Roman"/>
+                <w:sz w:val="20"/>
+              </w:rPr>
+              <w:t>2) How long, in seconds, does it take for the air in your lungs to accelerate from rest to 150 km/h, assuming a constant acceleration of 83 m/s²? [5 pts]</w:t>
+            </w:r>
+          </w:p>
+        </w:tc>
+      </w:tr>
+      <w:tr>
+        <w:tc>
+          <w:tcPr>
+            <w:tcW w:type="dxa" w:w="5760"/>
+            <w:tcMar>
+              <w:top w:w="80" w:type="dxa"/>
+              <w:bottom w:w="80" w:type="dxa"/>
+              <w:start w:w="120" w:type="dxa"/>
+              <w:end w:w="120" w:type="dxa"/>
+            </w:tcMar>
+          </w:tcPr>
+          <w:p>
+            <w:pPr>
+              <w:spacing w:before="0" w:after="0"/>
+              <w:jc w:val="right"/>
+            </w:pPr>
+            <w:r>
+              <w:rPr>
+                <w:rFonts w:ascii="Times New Roman" w:hAnsi="Times New Roman"/>
+                <w:sz w:val="20"/>
+              </w:rPr>
+              <w:t>Questionnaire No. PHYS1-SC2-11</w:t>
+            </w:r>
+          </w:p>
+          <w:p>
+            <w:pPr>
+              <w:spacing w:before="0" w:after="0"/>
+              <w:jc w:val="center"/>
+            </w:pPr>
+            <w:r>
+              <w:rPr>
+                <w:rFonts w:ascii="Times New Roman" w:hAnsi="Times New Roman"/>
+                <w:b/>
+                <w:sz w:val="20"/>
+              </w:rPr>
+              <w:t>SKILL CHECK 2</w:t>
+            </w:r>
+          </w:p>
+          <w:p>
+            <w:pPr>
+              <w:spacing w:before="0" w:after="120"/>
+              <w:jc w:val="center"/>
+            </w:pPr>
+            <w:r>
+              <w:rPr>
+                <w:rFonts w:ascii="Times New Roman" w:hAnsi="Times New Roman"/>
+                <w:sz w:val="20"/>
+              </w:rPr>
+              <w:t>Physics 1</w:t>
+            </w:r>
+          </w:p>
+          <w:p>
+            <w:pPr>
+              <w:spacing w:before="0" w:after="120"/>
+            </w:pPr>
+            <w:r>
+              <w:rPr>
+                <w:rFonts w:ascii="Times New Roman" w:hAnsi="Times New Roman"/>
+                <w:b/>
+                <w:sz w:val="20"/>
+              </w:rPr>
+              <w:t>Instructions:</w:t>
+            </w:r>
+            <w:r>
+              <w:rPr>
+                <w:rFonts w:ascii="Times New Roman" w:hAnsi="Times New Roman"/>
+                <w:sz w:val="20"/>
+              </w:rPr>
+              <w:t xml:space="preserve"> Do not write anything on this paper. Solve the problems using the Given-Required-Solution format. Show the isolation of the target variable before substituting any numerical values.</w:t>
+            </w:r>
+          </w:p>
+          <w:p>
+            <w:pPr>
+              <w:spacing w:before="0" w:after="120"/>
+            </w:pPr>
+            <w:r>
+              <w:rPr>
+                <w:rFonts w:ascii="Times New Roman" w:hAnsi="Times New Roman"/>
+                <w:sz w:val="20"/>
+              </w:rPr>
+              <w:t>1) A jet plane is cruising at 280 m/s when suddenly the pilot turns the engines to full throttle. After traveling 4.0 km, the jet moves with a speed of 380 m/s. What is the jet’s acceleration, assuming it to be a constant acceleration? [5 pts]</w:t>
+            </w:r>
+          </w:p>
+          <w:p>
+            <w:pPr>
+              <w:spacing w:before="0" w:after="0"/>
+            </w:pPr>
+            <w:r>
+              <w:rPr>
+                <w:rFonts w:ascii="Times New Roman" w:hAnsi="Times New Roman"/>
+                <w:sz w:val="20"/>
+              </w:rPr>
+              <w:t>2) How long, in seconds, does it take for the air in your lungs to accelerate from rest to 150 km/h, assuming a constant acceleration of 83 m/s²? [5 pts]</w:t>
+            </w:r>
+          </w:p>
+        </w:tc>
+        <w:tc>
+          <w:tcPr>
+            <w:tcW w:type="dxa" w:w="5760"/>
+            <w:tcMar>
+              <w:top w:w="80" w:type="dxa"/>
+              <w:bottom w:w="80" w:type="dxa"/>
+              <w:start w:w="120" w:type="dxa"/>
+              <w:end w:w="120" w:type="dxa"/>
+            </w:tcMar>
+          </w:tcPr>
+          <w:p>
+            <w:pPr>
+              <w:spacing w:before="0" w:after="0"/>
+              <w:jc w:val="right"/>
+            </w:pPr>
+            <w:r>
+              <w:rPr>
+                <w:rFonts w:ascii="Times New Roman" w:hAnsi="Times New Roman"/>
+                <w:sz w:val="20"/>
+              </w:rPr>
+              <w:t>Questionnaire No. PHYS1-SC2-12</w:t>
             </w:r>
           </w:p>
           <w:p>
@@ -838,6 +1218,7 @@
         <w:jc w:val="center"/>
         <w:tblLook w:firstColumn="1" w:firstRow="1" w:lastColumn="0" w:lastRow="0" w:noHBand="0" w:noVBand="1" w:val="04A0"/>
         <w:tblW w:w="5000" w:type="pct"/>
+        <w:tblLayout w:type="fixed"/>
         <w:tblBorders>
           <w:top w:val="single" w:sz="12" w:space="0" w:color="000000"/>
           <w:left w:val="single" w:sz="12" w:space="0" w:color="000000"/>
@@ -848,12 +1229,13 @@
         </w:tblBorders>
       </w:tblPr>
       <w:tblGrid>
-        <w:gridCol w:w="11674"/>
+        <w:gridCol w:w="5760"/>
+        <w:gridCol w:w="5760"/>
       </w:tblGrid>
       <w:tr>
         <w:tc>
           <w:tcPr>
-            <w:tcW w:type="dxa" w:w="11674"/>
+            <w:tcW w:type="dxa" w:w="5760"/>
             <w:tcMar>
               <w:top w:w="80" w:type="dxa"/>
               <w:bottom w:w="80" w:type="dxa"/>
@@ -871,7 +1253,7 @@
                 <w:rFonts w:ascii="Times New Roman" w:hAnsi="Times New Roman"/>
                 <w:sz w:val="20"/>
               </w:rPr>
-              <w:t>Questionnaire No. PHYS1-SC2-09</w:t>
+              <w:t>Questionnaire No. PHYS1-SC2-13</w:t>
             </w:r>
           </w:p>
           <w:p>
@@ -946,11 +1328,9 @@
             </w:r>
           </w:p>
         </w:tc>
-      </w:tr>
-      <w:tr>
         <w:tc>
           <w:tcPr>
-            <w:tcW w:type="dxa" w:w="11674"/>
+            <w:tcW w:type="dxa" w:w="5760"/>
             <w:tcMar>
               <w:top w:w="80" w:type="dxa"/>
               <w:bottom w:w="80" w:type="dxa"/>
@@ -968,7 +1348,7 @@
                 <w:rFonts w:ascii="Times New Roman" w:hAnsi="Times New Roman"/>
                 <w:sz w:val="20"/>
               </w:rPr>
-              <w:t>Questionnaire No. PHYS1-SC2-10</w:t>
+              <w:t>Questionnaire No. PHYS1-SC2-14</w:t>
             </w:r>
           </w:p>
           <w:p>
@@ -1047,7 +1427,7 @@
       <w:tr>
         <w:tc>
           <w:tcPr>
-            <w:tcW w:type="dxa" w:w="11674"/>
+            <w:tcW w:type="dxa" w:w="5760"/>
             <w:tcMar>
               <w:top w:w="80" w:type="dxa"/>
               <w:bottom w:w="80" w:type="dxa"/>
@@ -1065,7 +1445,7 @@
                 <w:rFonts w:ascii="Times New Roman" w:hAnsi="Times New Roman"/>
                 <w:sz w:val="20"/>
               </w:rPr>
-              <w:t>Questionnaire No. PHYS1-SC2-11</w:t>
+              <w:t>Questionnaire No. PHYS1-SC2-15</w:t>
             </w:r>
           </w:p>
           <w:p>
@@ -1140,11 +1520,9 @@
             </w:r>
           </w:p>
         </w:tc>
-      </w:tr>
-      <w:tr>
         <w:tc>
           <w:tcPr>
-            <w:tcW w:type="dxa" w:w="11674"/>
+            <w:tcW w:type="dxa" w:w="5760"/>
             <w:tcMar>
               <w:top w:w="80" w:type="dxa"/>
               <w:bottom w:w="80" w:type="dxa"/>
@@ -1162,7 +1540,199 @@
                 <w:rFonts w:ascii="Times New Roman" w:hAnsi="Times New Roman"/>
                 <w:sz w:val="20"/>
               </w:rPr>
-              <w:t>Questionnaire No. PHYS1-SC2-12</w:t>
+              <w:t>Questionnaire No. PHYS1-SC2-16</w:t>
+            </w:r>
+          </w:p>
+          <w:p>
+            <w:pPr>
+              <w:spacing w:before="0" w:after="0"/>
+              <w:jc w:val="center"/>
+            </w:pPr>
+            <w:r>
+              <w:rPr>
+                <w:rFonts w:ascii="Times New Roman" w:hAnsi="Times New Roman"/>
+                <w:b/>
+                <w:sz w:val="20"/>
+              </w:rPr>
+              <w:t>SKILL CHECK 2</w:t>
+            </w:r>
+          </w:p>
+          <w:p>
+            <w:pPr>
+              <w:spacing w:before="0" w:after="120"/>
+              <w:jc w:val="center"/>
+            </w:pPr>
+            <w:r>
+              <w:rPr>
+                <w:rFonts w:ascii="Times New Roman" w:hAnsi="Times New Roman"/>
+                <w:sz w:val="20"/>
+              </w:rPr>
+              <w:t>Physics 1</w:t>
+            </w:r>
+          </w:p>
+          <w:p>
+            <w:pPr>
+              <w:spacing w:before="0" w:after="120"/>
+            </w:pPr>
+            <w:r>
+              <w:rPr>
+                <w:rFonts w:ascii="Times New Roman" w:hAnsi="Times New Roman"/>
+                <w:b/>
+                <w:sz w:val="20"/>
+              </w:rPr>
+              <w:t>Instructions:</w:t>
+            </w:r>
+            <w:r>
+              <w:rPr>
+                <w:rFonts w:ascii="Times New Roman" w:hAnsi="Times New Roman"/>
+                <w:sz w:val="20"/>
+              </w:rPr>
+              <w:t xml:space="preserve"> Do not write anything on this paper. Solve the problems using the Given-Required-Solution format. Show the isolation of the target variable before substituting any numerical values.</w:t>
+            </w:r>
+          </w:p>
+          <w:p>
+            <w:pPr>
+              <w:spacing w:before="0" w:after="120"/>
+            </w:pPr>
+            <w:r>
+              <w:rPr>
+                <w:rFonts w:ascii="Times New Roman" w:hAnsi="Times New Roman"/>
+                <w:sz w:val="20"/>
+              </w:rPr>
+              <w:t>1) A jet plane is cruising at 280 m/s when suddenly the pilot turns the engines to full throttle. After traveling 4.0 km, the jet moves with a speed of 380 m/s. What is the jet’s acceleration, assuming it to be a constant acceleration? [5 pts]</w:t>
+            </w:r>
+          </w:p>
+          <w:p>
+            <w:pPr>
+              <w:spacing w:before="0" w:after="0"/>
+            </w:pPr>
+            <w:r>
+              <w:rPr>
+                <w:rFonts w:ascii="Times New Roman" w:hAnsi="Times New Roman"/>
+                <w:sz w:val="20"/>
+              </w:rPr>
+              <w:t>2) How long, in seconds, does it take for the air in your lungs to accelerate from rest to 150 km/h, assuming a constant acceleration of 83 m/s²? [5 pts]</w:t>
+            </w:r>
+          </w:p>
+        </w:tc>
+      </w:tr>
+      <w:tr>
+        <w:tc>
+          <w:tcPr>
+            <w:tcW w:type="dxa" w:w="5760"/>
+            <w:tcMar>
+              <w:top w:w="80" w:type="dxa"/>
+              <w:bottom w:w="80" w:type="dxa"/>
+              <w:start w:w="120" w:type="dxa"/>
+              <w:end w:w="120" w:type="dxa"/>
+            </w:tcMar>
+          </w:tcPr>
+          <w:p>
+            <w:pPr>
+              <w:spacing w:before="0" w:after="0"/>
+              <w:jc w:val="right"/>
+            </w:pPr>
+            <w:r>
+              <w:rPr>
+                <w:rFonts w:ascii="Times New Roman" w:hAnsi="Times New Roman"/>
+                <w:sz w:val="20"/>
+              </w:rPr>
+              <w:t>Questionnaire No. PHYS1-SC2-17</w:t>
+            </w:r>
+          </w:p>
+          <w:p>
+            <w:pPr>
+              <w:spacing w:before="0" w:after="0"/>
+              <w:jc w:val="center"/>
+            </w:pPr>
+            <w:r>
+              <w:rPr>
+                <w:rFonts w:ascii="Times New Roman" w:hAnsi="Times New Roman"/>
+                <w:b/>
+                <w:sz w:val="20"/>
+              </w:rPr>
+              <w:t>SKILL CHECK 2</w:t>
+            </w:r>
+          </w:p>
+          <w:p>
+            <w:pPr>
+              <w:spacing w:before="0" w:after="120"/>
+              <w:jc w:val="center"/>
+            </w:pPr>
+            <w:r>
+              <w:rPr>
+                <w:rFonts w:ascii="Times New Roman" w:hAnsi="Times New Roman"/>
+                <w:sz w:val="20"/>
+              </w:rPr>
+              <w:t>Physics 1</w:t>
+            </w:r>
+          </w:p>
+          <w:p>
+            <w:pPr>
+              <w:spacing w:before="0" w:after="120"/>
+            </w:pPr>
+            <w:r>
+              <w:rPr>
+                <w:rFonts w:ascii="Times New Roman" w:hAnsi="Times New Roman"/>
+                <w:b/>
+                <w:sz w:val="20"/>
+              </w:rPr>
+              <w:t>Instructions:</w:t>
+            </w:r>
+            <w:r>
+              <w:rPr>
+                <w:rFonts w:ascii="Times New Roman" w:hAnsi="Times New Roman"/>
+                <w:sz w:val="20"/>
+              </w:rPr>
+              <w:t xml:space="preserve"> Do not write anything on this paper. Solve the problems using the Given-Required-Solution format. Show the isolation of the target variable before substituting any numerical values.</w:t>
+            </w:r>
+          </w:p>
+          <w:p>
+            <w:pPr>
+              <w:spacing w:before="0" w:after="120"/>
+            </w:pPr>
+            <w:r>
+              <w:rPr>
+                <w:rFonts w:ascii="Times New Roman" w:hAnsi="Times New Roman"/>
+                <w:sz w:val="20"/>
+              </w:rPr>
+              <w:t>1) A jet plane is cruising at 280 m/s when suddenly the pilot turns the engines to full throttle. After traveling 4.0 km, the jet moves with a speed of 380 m/s. What is the jet’s acceleration, assuming it to be a constant acceleration? [5 pts]</w:t>
+            </w:r>
+          </w:p>
+          <w:p>
+            <w:pPr>
+              <w:spacing w:before="0" w:after="0"/>
+            </w:pPr>
+            <w:r>
+              <w:rPr>
+                <w:rFonts w:ascii="Times New Roman" w:hAnsi="Times New Roman"/>
+                <w:sz w:val="20"/>
+              </w:rPr>
+              <w:t>2) How long, in seconds, does it take for the air in your lungs to accelerate from rest to 150 km/h, assuming a constant acceleration of 83 m/s²? [5 pts]</w:t>
+            </w:r>
+          </w:p>
+        </w:tc>
+        <w:tc>
+          <w:tcPr>
+            <w:tcW w:type="dxa" w:w="5760"/>
+            <w:tcMar>
+              <w:top w:w="80" w:type="dxa"/>
+              <w:bottom w:w="80" w:type="dxa"/>
+              <w:start w:w="120" w:type="dxa"/>
+              <w:end w:w="120" w:type="dxa"/>
+            </w:tcMar>
+          </w:tcPr>
+          <w:p>
+            <w:pPr>
+              <w:spacing w:before="0" w:after="0"/>
+              <w:jc w:val="right"/>
+            </w:pPr>
+            <w:r>
+              <w:rPr>
+                <w:rFonts w:ascii="Times New Roman" w:hAnsi="Times New Roman"/>
+                <w:sz w:val="20"/>
+              </w:rPr>
+              <w:t>Questionnaire No. PHYS1-SC2-18</w:t>
             </w:r>
           </w:p>
           <w:p>
@@ -1253,6 +1823,7 @@
         <w:jc w:val="center"/>
         <w:tblLook w:firstColumn="1" w:firstRow="1" w:lastColumn="0" w:lastRow="0" w:noHBand="0" w:noVBand="1" w:val="04A0"/>
         <w:tblW w:w="5000" w:type="pct"/>
+        <w:tblLayout w:type="fixed"/>
         <w:tblBorders>
           <w:top w:val="single" w:sz="12" w:space="0" w:color="000000"/>
           <w:left w:val="single" w:sz="12" w:space="0" w:color="000000"/>
@@ -1263,12 +1834,13 @@
         </w:tblBorders>
       </w:tblPr>
       <w:tblGrid>
-        <w:gridCol w:w="11674"/>
+        <w:gridCol w:w="5760"/>
+        <w:gridCol w:w="5760"/>
       </w:tblGrid>
       <w:tr>
         <w:tc>
           <w:tcPr>
-            <w:tcW w:type="dxa" w:w="11674"/>
+            <w:tcW w:type="dxa" w:w="5760"/>
             <w:tcMar>
               <w:top w:w="80" w:type="dxa"/>
               <w:bottom w:w="80" w:type="dxa"/>
@@ -1286,7 +1858,7 @@
                 <w:rFonts w:ascii="Times New Roman" w:hAnsi="Times New Roman"/>
                 <w:sz w:val="20"/>
               </w:rPr>
-              <w:t>Questionnaire No. PHYS1-SC2-13</w:t>
+              <w:t>Questionnaire No. PHYS1-SC2-19</w:t>
             </w:r>
           </w:p>
           <w:p>
@@ -1361,11 +1933,9 @@
             </w:r>
           </w:p>
         </w:tc>
-      </w:tr>
-      <w:tr>
         <w:tc>
           <w:tcPr>
-            <w:tcW w:type="dxa" w:w="11674"/>
+            <w:tcW w:type="dxa" w:w="5760"/>
             <w:tcMar>
               <w:top w:w="80" w:type="dxa"/>
               <w:bottom w:w="80" w:type="dxa"/>
@@ -1383,7 +1953,7 @@
                 <w:rFonts w:ascii="Times New Roman" w:hAnsi="Times New Roman"/>
                 <w:sz w:val="20"/>
               </w:rPr>
-              <w:t>Questionnaire No. PHYS1-SC2-14</w:t>
+              <w:t>Questionnaire No. PHYS1-SC2-20</w:t>
             </w:r>
           </w:p>
           <w:p>
@@ -1462,7 +2032,7 @@
       <w:tr>
         <w:tc>
           <w:tcPr>
-            <w:tcW w:type="dxa" w:w="11674"/>
+            <w:tcW w:type="dxa" w:w="5760"/>
             <w:tcMar>
               <w:top w:w="80" w:type="dxa"/>
               <w:bottom w:w="80" w:type="dxa"/>
@@ -1480,7 +2050,7 @@
                 <w:rFonts w:ascii="Times New Roman" w:hAnsi="Times New Roman"/>
                 <w:sz w:val="20"/>
               </w:rPr>
-              <w:t>Questionnaire No. PHYS1-SC2-15</w:t>
+              <w:t>Questionnaire No. PHYS1-SC2-21</w:t>
             </w:r>
           </w:p>
           <w:p>
@@ -1555,11 +2125,9 @@
             </w:r>
           </w:p>
         </w:tc>
-      </w:tr>
-      <w:tr>
         <w:tc>
           <w:tcPr>
-            <w:tcW w:type="dxa" w:w="11674"/>
+            <w:tcW w:type="dxa" w:w="5760"/>
             <w:tcMar>
               <w:top w:w="80" w:type="dxa"/>
               <w:bottom w:w="80" w:type="dxa"/>
@@ -1577,7 +2145,199 @@
                 <w:rFonts w:ascii="Times New Roman" w:hAnsi="Times New Roman"/>
                 <w:sz w:val="20"/>
               </w:rPr>
-              <w:t>Questionnaire No. PHYS1-SC2-16</w:t>
+              <w:t>Questionnaire No. PHYS1-SC2-22</w:t>
+            </w:r>
+          </w:p>
+          <w:p>
+            <w:pPr>
+              <w:spacing w:before="0" w:after="0"/>
+              <w:jc w:val="center"/>
+            </w:pPr>
+            <w:r>
+              <w:rPr>
+                <w:rFonts w:ascii="Times New Roman" w:hAnsi="Times New Roman"/>
+                <w:b/>
+                <w:sz w:val="20"/>
+              </w:rPr>
+              <w:t>SKILL CHECK 2</w:t>
+            </w:r>
+          </w:p>
+          <w:p>
+            <w:pPr>
+              <w:spacing w:before="0" w:after="120"/>
+              <w:jc w:val="center"/>
+            </w:pPr>
+            <w:r>
+              <w:rPr>
+                <w:rFonts w:ascii="Times New Roman" w:hAnsi="Times New Roman"/>
+                <w:sz w:val="20"/>
+              </w:rPr>
+              <w:t>Physics 1</w:t>
+            </w:r>
+          </w:p>
+          <w:p>
+            <w:pPr>
+              <w:spacing w:before="0" w:after="120"/>
+            </w:pPr>
+            <w:r>
+              <w:rPr>
+                <w:rFonts w:ascii="Times New Roman" w:hAnsi="Times New Roman"/>
+                <w:b/>
+                <w:sz w:val="20"/>
+              </w:rPr>
+              <w:t>Instructions:</w:t>
+            </w:r>
+            <w:r>
+              <w:rPr>
+                <w:rFonts w:ascii="Times New Roman" w:hAnsi="Times New Roman"/>
+                <w:sz w:val="20"/>
+              </w:rPr>
+              <w:t xml:space="preserve"> Do not write anything on this paper. Solve the problems using the Given-Required-Solution format. Show the isolation of the target variable before substituting any numerical values.</w:t>
+            </w:r>
+          </w:p>
+          <w:p>
+            <w:pPr>
+              <w:spacing w:before="0" w:after="120"/>
+            </w:pPr>
+            <w:r>
+              <w:rPr>
+                <w:rFonts w:ascii="Times New Roman" w:hAnsi="Times New Roman"/>
+                <w:sz w:val="20"/>
+              </w:rPr>
+              <w:t>1) A jet plane is cruising at 280 m/s when suddenly the pilot turns the engines to full throttle. After traveling 4.0 km, the jet moves with a speed of 380 m/s. What is the jet’s acceleration, assuming it to be a constant acceleration? [5 pts]</w:t>
+            </w:r>
+          </w:p>
+          <w:p>
+            <w:pPr>
+              <w:spacing w:before="0" w:after="0"/>
+            </w:pPr>
+            <w:r>
+              <w:rPr>
+                <w:rFonts w:ascii="Times New Roman" w:hAnsi="Times New Roman"/>
+                <w:sz w:val="20"/>
+              </w:rPr>
+              <w:t>2) How long, in seconds, does it take for the air in your lungs to accelerate from rest to 150 km/h, assuming a constant acceleration of 83 m/s²? [5 pts]</w:t>
+            </w:r>
+          </w:p>
+        </w:tc>
+      </w:tr>
+      <w:tr>
+        <w:tc>
+          <w:tcPr>
+            <w:tcW w:type="dxa" w:w="5760"/>
+            <w:tcMar>
+              <w:top w:w="80" w:type="dxa"/>
+              <w:bottom w:w="80" w:type="dxa"/>
+              <w:start w:w="120" w:type="dxa"/>
+              <w:end w:w="120" w:type="dxa"/>
+            </w:tcMar>
+          </w:tcPr>
+          <w:p>
+            <w:pPr>
+              <w:spacing w:before="0" w:after="0"/>
+              <w:jc w:val="right"/>
+            </w:pPr>
+            <w:r>
+              <w:rPr>
+                <w:rFonts w:ascii="Times New Roman" w:hAnsi="Times New Roman"/>
+                <w:sz w:val="20"/>
+              </w:rPr>
+              <w:t>Questionnaire No. PHYS1-SC2-23</w:t>
+            </w:r>
+          </w:p>
+          <w:p>
+            <w:pPr>
+              <w:spacing w:before="0" w:after="0"/>
+              <w:jc w:val="center"/>
+            </w:pPr>
+            <w:r>
+              <w:rPr>
+                <w:rFonts w:ascii="Times New Roman" w:hAnsi="Times New Roman"/>
+                <w:b/>
+                <w:sz w:val="20"/>
+              </w:rPr>
+              <w:t>SKILL CHECK 2</w:t>
+            </w:r>
+          </w:p>
+          <w:p>
+            <w:pPr>
+              <w:spacing w:before="0" w:after="120"/>
+              <w:jc w:val="center"/>
+            </w:pPr>
+            <w:r>
+              <w:rPr>
+                <w:rFonts w:ascii="Times New Roman" w:hAnsi="Times New Roman"/>
+                <w:sz w:val="20"/>
+              </w:rPr>
+              <w:t>Physics 1</w:t>
+            </w:r>
+          </w:p>
+          <w:p>
+            <w:pPr>
+              <w:spacing w:before="0" w:after="120"/>
+            </w:pPr>
+            <w:r>
+              <w:rPr>
+                <w:rFonts w:ascii="Times New Roman" w:hAnsi="Times New Roman"/>
+                <w:b/>
+                <w:sz w:val="20"/>
+              </w:rPr>
+              <w:t>Instructions:</w:t>
+            </w:r>
+            <w:r>
+              <w:rPr>
+                <w:rFonts w:ascii="Times New Roman" w:hAnsi="Times New Roman"/>
+                <w:sz w:val="20"/>
+              </w:rPr>
+              <w:t xml:space="preserve"> Do not write anything on this paper. Solve the problems using the Given-Required-Solution format. Show the isolation of the target variable before substituting any numerical values.</w:t>
+            </w:r>
+          </w:p>
+          <w:p>
+            <w:pPr>
+              <w:spacing w:before="0" w:after="120"/>
+            </w:pPr>
+            <w:r>
+              <w:rPr>
+                <w:rFonts w:ascii="Times New Roman" w:hAnsi="Times New Roman"/>
+                <w:sz w:val="20"/>
+              </w:rPr>
+              <w:t>1) A jet plane is cruising at 280 m/s when suddenly the pilot turns the engines to full throttle. After traveling 4.0 km, the jet moves with a speed of 380 m/s. What is the jet’s acceleration, assuming it to be a constant acceleration? [5 pts]</w:t>
+            </w:r>
+          </w:p>
+          <w:p>
+            <w:pPr>
+              <w:spacing w:before="0" w:after="0"/>
+            </w:pPr>
+            <w:r>
+              <w:rPr>
+                <w:rFonts w:ascii="Times New Roman" w:hAnsi="Times New Roman"/>
+                <w:sz w:val="20"/>
+              </w:rPr>
+              <w:t>2) How long, in seconds, does it take for the air in your lungs to accelerate from rest to 150 km/h, assuming a constant acceleration of 83 m/s²? [5 pts]</w:t>
+            </w:r>
+          </w:p>
+        </w:tc>
+        <w:tc>
+          <w:tcPr>
+            <w:tcW w:type="dxa" w:w="5760"/>
+            <w:tcMar>
+              <w:top w:w="80" w:type="dxa"/>
+              <w:bottom w:w="80" w:type="dxa"/>
+              <w:start w:w="120" w:type="dxa"/>
+              <w:end w:w="120" w:type="dxa"/>
+            </w:tcMar>
+          </w:tcPr>
+          <w:p>
+            <w:pPr>
+              <w:spacing w:before="0" w:after="0"/>
+              <w:jc w:val="right"/>
+            </w:pPr>
+            <w:r>
+              <w:rPr>
+                <w:rFonts w:ascii="Times New Roman" w:hAnsi="Times New Roman"/>
+                <w:sz w:val="20"/>
+              </w:rPr>
+              <w:t>Questionnaire No. PHYS1-SC2-24</w:t>
             </w:r>
           </w:p>
           <w:p>
@@ -1668,6 +2428,7 @@
         <w:jc w:val="center"/>
         <w:tblLook w:firstColumn="1" w:firstRow="1" w:lastColumn="0" w:lastRow="0" w:noHBand="0" w:noVBand="1" w:val="04A0"/>
         <w:tblW w:w="5000" w:type="pct"/>
+        <w:tblLayout w:type="fixed"/>
         <w:tblBorders>
           <w:top w:val="single" w:sz="12" w:space="0" w:color="000000"/>
           <w:left w:val="single" w:sz="12" w:space="0" w:color="000000"/>
@@ -1678,12 +2439,13 @@
         </w:tblBorders>
       </w:tblPr>
       <w:tblGrid>
-        <w:gridCol w:w="11674"/>
+        <w:gridCol w:w="5760"/>
+        <w:gridCol w:w="5760"/>
       </w:tblGrid>
       <w:tr>
         <w:tc>
           <w:tcPr>
-            <w:tcW w:type="dxa" w:w="11674"/>
+            <w:tcW w:type="dxa" w:w="5760"/>
             <w:tcMar>
               <w:top w:w="80" w:type="dxa"/>
               <w:bottom w:w="80" w:type="dxa"/>
@@ -1701,7 +2463,7 @@
                 <w:rFonts w:ascii="Times New Roman" w:hAnsi="Times New Roman"/>
                 <w:sz w:val="20"/>
               </w:rPr>
-              <w:t>Questionnaire No. PHYS1-SC2-17</w:t>
+              <w:t>Questionnaire No. PHYS1-SC2-25</w:t>
             </w:r>
           </w:p>
           <w:p>
@@ -1776,11 +2538,9 @@
             </w:r>
           </w:p>
         </w:tc>
-      </w:tr>
-      <w:tr>
         <w:tc>
           <w:tcPr>
-            <w:tcW w:type="dxa" w:w="11674"/>
+            <w:tcW w:type="dxa" w:w="5760"/>
             <w:tcMar>
               <w:top w:w="80" w:type="dxa"/>
               <w:bottom w:w="80" w:type="dxa"/>
@@ -1798,7 +2558,7 @@
                 <w:rFonts w:ascii="Times New Roman" w:hAnsi="Times New Roman"/>
                 <w:sz w:val="20"/>
               </w:rPr>
-              <w:t>Questionnaire No. PHYS1-SC2-18</w:t>
+              <w:t>Questionnaire No. PHYS1-SC2-26</w:t>
             </w:r>
           </w:p>
           <w:p>
@@ -1877,7 +2637,7 @@
       <w:tr>
         <w:tc>
           <w:tcPr>
-            <w:tcW w:type="dxa" w:w="11674"/>
+            <w:tcW w:type="dxa" w:w="5760"/>
             <w:tcMar>
               <w:top w:w="80" w:type="dxa"/>
               <w:bottom w:w="80" w:type="dxa"/>
@@ -1895,7 +2655,7 @@
                 <w:rFonts w:ascii="Times New Roman" w:hAnsi="Times New Roman"/>
                 <w:sz w:val="20"/>
               </w:rPr>
-              <w:t>Questionnaire No. PHYS1-SC2-19</w:t>
+              <w:t>Questionnaire No. PHYS1-SC2-27</w:t>
             </w:r>
           </w:p>
           <w:p>
@@ -1970,11 +2730,9 @@
             </w:r>
           </w:p>
         </w:tc>
-      </w:tr>
-      <w:tr>
         <w:tc>
           <w:tcPr>
-            <w:tcW w:type="dxa" w:w="11674"/>
+            <w:tcW w:type="dxa" w:w="5760"/>
             <w:tcMar>
               <w:top w:w="80" w:type="dxa"/>
               <w:bottom w:w="80" w:type="dxa"/>
@@ -1992,7 +2750,199 @@
                 <w:rFonts w:ascii="Times New Roman" w:hAnsi="Times New Roman"/>
                 <w:sz w:val="20"/>
               </w:rPr>
-              <w:t>Questionnaire No. PHYS1-SC2-20</w:t>
+              <w:t>Questionnaire No. PHYS1-SC2-28</w:t>
+            </w:r>
+          </w:p>
+          <w:p>
+            <w:pPr>
+              <w:spacing w:before="0" w:after="0"/>
+              <w:jc w:val="center"/>
+            </w:pPr>
+            <w:r>
+              <w:rPr>
+                <w:rFonts w:ascii="Times New Roman" w:hAnsi="Times New Roman"/>
+                <w:b/>
+                <w:sz w:val="20"/>
+              </w:rPr>
+              <w:t>SKILL CHECK 2</w:t>
+            </w:r>
+          </w:p>
+          <w:p>
+            <w:pPr>
+              <w:spacing w:before="0" w:after="120"/>
+              <w:jc w:val="center"/>
+            </w:pPr>
+            <w:r>
+              <w:rPr>
+                <w:rFonts w:ascii="Times New Roman" w:hAnsi="Times New Roman"/>
+                <w:sz w:val="20"/>
+              </w:rPr>
+              <w:t>Physics 1</w:t>
+            </w:r>
+          </w:p>
+          <w:p>
+            <w:pPr>
+              <w:spacing w:before="0" w:after="120"/>
+            </w:pPr>
+            <w:r>
+              <w:rPr>
+                <w:rFonts w:ascii="Times New Roman" w:hAnsi="Times New Roman"/>
+                <w:b/>
+                <w:sz w:val="20"/>
+              </w:rPr>
+              <w:t>Instructions:</w:t>
+            </w:r>
+            <w:r>
+              <w:rPr>
+                <w:rFonts w:ascii="Times New Roman" w:hAnsi="Times New Roman"/>
+                <w:sz w:val="20"/>
+              </w:rPr>
+              <w:t xml:space="preserve"> Do not write anything on this paper. Solve the problems using the Given-Required-Solution format. Show the isolation of the target variable before substituting any numerical values.</w:t>
+            </w:r>
+          </w:p>
+          <w:p>
+            <w:pPr>
+              <w:spacing w:before="0" w:after="120"/>
+            </w:pPr>
+            <w:r>
+              <w:rPr>
+                <w:rFonts w:ascii="Times New Roman" w:hAnsi="Times New Roman"/>
+                <w:sz w:val="20"/>
+              </w:rPr>
+              <w:t>1) A jet plane is cruising at 280 m/s when suddenly the pilot turns the engines to full throttle. After traveling 4.0 km, the jet moves with a speed of 380 m/s. What is the jet’s acceleration, assuming it to be a constant acceleration? [5 pts]</w:t>
+            </w:r>
+          </w:p>
+          <w:p>
+            <w:pPr>
+              <w:spacing w:before="0" w:after="0"/>
+            </w:pPr>
+            <w:r>
+              <w:rPr>
+                <w:rFonts w:ascii="Times New Roman" w:hAnsi="Times New Roman"/>
+                <w:sz w:val="20"/>
+              </w:rPr>
+              <w:t>2) How long, in seconds, does it take for the air in your lungs to accelerate from rest to 150 km/h, assuming a constant acceleration of 83 m/s²? [5 pts]</w:t>
+            </w:r>
+          </w:p>
+        </w:tc>
+      </w:tr>
+      <w:tr>
+        <w:tc>
+          <w:tcPr>
+            <w:tcW w:type="dxa" w:w="5760"/>
+            <w:tcMar>
+              <w:top w:w="80" w:type="dxa"/>
+              <w:bottom w:w="80" w:type="dxa"/>
+              <w:start w:w="120" w:type="dxa"/>
+              <w:end w:w="120" w:type="dxa"/>
+            </w:tcMar>
+          </w:tcPr>
+          <w:p>
+            <w:pPr>
+              <w:spacing w:before="0" w:after="0"/>
+              <w:jc w:val="right"/>
+            </w:pPr>
+            <w:r>
+              <w:rPr>
+                <w:rFonts w:ascii="Times New Roman" w:hAnsi="Times New Roman"/>
+                <w:sz w:val="20"/>
+              </w:rPr>
+              <w:t>Questionnaire No. PHYS1-SC2-29</w:t>
+            </w:r>
+          </w:p>
+          <w:p>
+            <w:pPr>
+              <w:spacing w:before="0" w:after="0"/>
+              <w:jc w:val="center"/>
+            </w:pPr>
+            <w:r>
+              <w:rPr>
+                <w:rFonts w:ascii="Times New Roman" w:hAnsi="Times New Roman"/>
+                <w:b/>
+                <w:sz w:val="20"/>
+              </w:rPr>
+              <w:t>SKILL CHECK 2</w:t>
+            </w:r>
+          </w:p>
+          <w:p>
+            <w:pPr>
+              <w:spacing w:before="0" w:after="120"/>
+              <w:jc w:val="center"/>
+            </w:pPr>
+            <w:r>
+              <w:rPr>
+                <w:rFonts w:ascii="Times New Roman" w:hAnsi="Times New Roman"/>
+                <w:sz w:val="20"/>
+              </w:rPr>
+              <w:t>Physics 1</w:t>
+            </w:r>
+          </w:p>
+          <w:p>
+            <w:pPr>
+              <w:spacing w:before="0" w:after="120"/>
+            </w:pPr>
+            <w:r>
+              <w:rPr>
+                <w:rFonts w:ascii="Times New Roman" w:hAnsi="Times New Roman"/>
+                <w:b/>
+                <w:sz w:val="20"/>
+              </w:rPr>
+              <w:t>Instructions:</w:t>
+            </w:r>
+            <w:r>
+              <w:rPr>
+                <w:rFonts w:ascii="Times New Roman" w:hAnsi="Times New Roman"/>
+                <w:sz w:val="20"/>
+              </w:rPr>
+              <w:t xml:space="preserve"> Do not write anything on this paper. Solve the problems using the Given-Required-Solution format. Show the isolation of the target variable before substituting any numerical values.</w:t>
+            </w:r>
+          </w:p>
+          <w:p>
+            <w:pPr>
+              <w:spacing w:before="0" w:after="120"/>
+            </w:pPr>
+            <w:r>
+              <w:rPr>
+                <w:rFonts w:ascii="Times New Roman" w:hAnsi="Times New Roman"/>
+                <w:sz w:val="20"/>
+              </w:rPr>
+              <w:t>1) A jet plane is cruising at 280 m/s when suddenly the pilot turns the engines to full throttle. After traveling 4.0 km, the jet moves with a speed of 380 m/s. What is the jet’s acceleration, assuming it to be a constant acceleration? [5 pts]</w:t>
+            </w:r>
+          </w:p>
+          <w:p>
+            <w:pPr>
+              <w:spacing w:before="0" w:after="0"/>
+            </w:pPr>
+            <w:r>
+              <w:rPr>
+                <w:rFonts w:ascii="Times New Roman" w:hAnsi="Times New Roman"/>
+                <w:sz w:val="20"/>
+              </w:rPr>
+              <w:t>2) How long, in seconds, does it take for the air in your lungs to accelerate from rest to 150 km/h, assuming a constant acceleration of 83 m/s²? [5 pts]</w:t>
+            </w:r>
+          </w:p>
+        </w:tc>
+        <w:tc>
+          <w:tcPr>
+            <w:tcW w:type="dxa" w:w="5760"/>
+            <w:tcMar>
+              <w:top w:w="80" w:type="dxa"/>
+              <w:bottom w:w="80" w:type="dxa"/>
+              <w:start w:w="120" w:type="dxa"/>
+              <w:end w:w="120" w:type="dxa"/>
+            </w:tcMar>
+          </w:tcPr>
+          <w:p>
+            <w:pPr>
+              <w:spacing w:before="0" w:after="0"/>
+              <w:jc w:val="right"/>
+            </w:pPr>
+            <w:r>
+              <w:rPr>
+                <w:rFonts w:ascii="Times New Roman" w:hAnsi="Times New Roman"/>
+                <w:sz w:val="20"/>
+              </w:rPr>
+              <w:t>Questionnaire No. PHYS1-SC2-30</w:t>
             </w:r>
           </w:p>
           <w:p>
@@ -2083,6 +3033,7 @@
         <w:jc w:val="center"/>
         <w:tblLook w:firstColumn="1" w:firstRow="1" w:lastColumn="0" w:lastRow="0" w:noHBand="0" w:noVBand="1" w:val="04A0"/>
         <w:tblW w:w="5000" w:type="pct"/>
+        <w:tblLayout w:type="fixed"/>
         <w:tblBorders>
           <w:top w:val="single" w:sz="12" w:space="0" w:color="000000"/>
           <w:left w:val="single" w:sz="12" w:space="0" w:color="000000"/>
@@ -2093,12 +3044,13 @@
         </w:tblBorders>
       </w:tblPr>
       <w:tblGrid>
-        <w:gridCol w:w="11674"/>
+        <w:gridCol w:w="5760"/>
+        <w:gridCol w:w="5760"/>
       </w:tblGrid>
       <w:tr>
         <w:tc>
           <w:tcPr>
-            <w:tcW w:type="dxa" w:w="11674"/>
+            <w:tcW w:type="dxa" w:w="5760"/>
             <w:tcMar>
               <w:top w:w="80" w:type="dxa"/>
               <w:bottom w:w="80" w:type="dxa"/>
@@ -2116,7 +3068,7 @@
                 <w:rFonts w:ascii="Times New Roman" w:hAnsi="Times New Roman"/>
                 <w:sz w:val="20"/>
               </w:rPr>
-              <w:t>Questionnaire No. PHYS1-SC2-21</w:t>
+              <w:t>Questionnaire No. PHYS1-SC2-31</w:t>
             </w:r>
           </w:p>
           <w:p>
@@ -2191,11 +3143,9 @@
             </w:r>
           </w:p>
         </w:tc>
-      </w:tr>
-      <w:tr>
         <w:tc>
           <w:tcPr>
-            <w:tcW w:type="dxa" w:w="11674"/>
+            <w:tcW w:type="dxa" w:w="5760"/>
             <w:tcMar>
               <w:top w:w="80" w:type="dxa"/>
               <w:bottom w:w="80" w:type="dxa"/>
@@ -2213,7 +3163,7 @@
                 <w:rFonts w:ascii="Times New Roman" w:hAnsi="Times New Roman"/>
                 <w:sz w:val="20"/>
               </w:rPr>
-              <w:t>Questionnaire No. PHYS1-SC2-22</w:t>
+              <w:t>Questionnaire No. PHYS1-SC2-32</w:t>
             </w:r>
           </w:p>
           <w:p>
@@ -2292,7 +3242,7 @@
       <w:tr>
         <w:tc>
           <w:tcPr>
-            <w:tcW w:type="dxa" w:w="11674"/>
+            <w:tcW w:type="dxa" w:w="5760"/>
             <w:tcMar>
               <w:top w:w="80" w:type="dxa"/>
               <w:bottom w:w="80" w:type="dxa"/>
@@ -2310,7 +3260,7 @@
                 <w:rFonts w:ascii="Times New Roman" w:hAnsi="Times New Roman"/>
                 <w:sz w:val="20"/>
               </w:rPr>
-              <w:t>Questionnaire No. PHYS1-SC2-23</w:t>
+              <w:t>Questionnaire No. PHYS1-SC2-33</w:t>
             </w:r>
           </w:p>
           <w:p>
@@ -2385,11 +3335,9 @@
             </w:r>
           </w:p>
         </w:tc>
-      </w:tr>
-      <w:tr>
         <w:tc>
           <w:tcPr>
-            <w:tcW w:type="dxa" w:w="11674"/>
+            <w:tcW w:type="dxa" w:w="5760"/>
             <w:tcMar>
               <w:top w:w="80" w:type="dxa"/>
               <w:bottom w:w="80" w:type="dxa"/>
@@ -2407,7 +3355,199 @@
                 <w:rFonts w:ascii="Times New Roman" w:hAnsi="Times New Roman"/>
                 <w:sz w:val="20"/>
               </w:rPr>
-              <w:t>Questionnaire No. PHYS1-SC2-24</w:t>
+              <w:t>Questionnaire No. PHYS1-SC2-34</w:t>
+            </w:r>
+          </w:p>
+          <w:p>
+            <w:pPr>
+              <w:spacing w:before="0" w:after="0"/>
+              <w:jc w:val="center"/>
+            </w:pPr>
+            <w:r>
+              <w:rPr>
+                <w:rFonts w:ascii="Times New Roman" w:hAnsi="Times New Roman"/>
+                <w:b/>
+                <w:sz w:val="20"/>
+              </w:rPr>
+              <w:t>SKILL CHECK 2</w:t>
+            </w:r>
+          </w:p>
+          <w:p>
+            <w:pPr>
+              <w:spacing w:before="0" w:after="120"/>
+              <w:jc w:val="center"/>
+            </w:pPr>
+            <w:r>
+              <w:rPr>
+                <w:rFonts w:ascii="Times New Roman" w:hAnsi="Times New Roman"/>
+                <w:sz w:val="20"/>
+              </w:rPr>
+              <w:t>Physics 1</w:t>
+            </w:r>
+          </w:p>
+          <w:p>
+            <w:pPr>
+              <w:spacing w:before="0" w:after="120"/>
+            </w:pPr>
+            <w:r>
+              <w:rPr>
+                <w:rFonts w:ascii="Times New Roman" w:hAnsi="Times New Roman"/>
+                <w:b/>
+                <w:sz w:val="20"/>
+              </w:rPr>
+              <w:t>Instructions:</w:t>
+            </w:r>
+            <w:r>
+              <w:rPr>
+                <w:rFonts w:ascii="Times New Roman" w:hAnsi="Times New Roman"/>
+                <w:sz w:val="20"/>
+              </w:rPr>
+              <w:t xml:space="preserve"> Do not write anything on this paper. Solve the problems using the Given-Required-Solution format. Show the isolation of the target variable before substituting any numerical values.</w:t>
+            </w:r>
+          </w:p>
+          <w:p>
+            <w:pPr>
+              <w:spacing w:before="0" w:after="120"/>
+            </w:pPr>
+            <w:r>
+              <w:rPr>
+                <w:rFonts w:ascii="Times New Roman" w:hAnsi="Times New Roman"/>
+                <w:sz w:val="20"/>
+              </w:rPr>
+              <w:t>1) A jet plane is cruising at 280 m/s when suddenly the pilot turns the engines to full throttle. After traveling 4.0 km, the jet moves with a speed of 380 m/s. What is the jet’s acceleration, assuming it to be a constant acceleration? [5 pts]</w:t>
+            </w:r>
+          </w:p>
+          <w:p>
+            <w:pPr>
+              <w:spacing w:before="0" w:after="0"/>
+            </w:pPr>
+            <w:r>
+              <w:rPr>
+                <w:rFonts w:ascii="Times New Roman" w:hAnsi="Times New Roman"/>
+                <w:sz w:val="20"/>
+              </w:rPr>
+              <w:t>2) How long, in seconds, does it take for the air in your lungs to accelerate from rest to 150 km/h, assuming a constant acceleration of 83 m/s²? [5 pts]</w:t>
+            </w:r>
+          </w:p>
+        </w:tc>
+      </w:tr>
+      <w:tr>
+        <w:tc>
+          <w:tcPr>
+            <w:tcW w:type="dxa" w:w="5760"/>
+            <w:tcMar>
+              <w:top w:w="80" w:type="dxa"/>
+              <w:bottom w:w="80" w:type="dxa"/>
+              <w:start w:w="120" w:type="dxa"/>
+              <w:end w:w="120" w:type="dxa"/>
+            </w:tcMar>
+          </w:tcPr>
+          <w:p>
+            <w:pPr>
+              <w:spacing w:before="0" w:after="0"/>
+              <w:jc w:val="right"/>
+            </w:pPr>
+            <w:r>
+              <w:rPr>
+                <w:rFonts w:ascii="Times New Roman" w:hAnsi="Times New Roman"/>
+                <w:sz w:val="20"/>
+              </w:rPr>
+              <w:t>Questionnaire No. PHYS1-SC2-35</w:t>
+            </w:r>
+          </w:p>
+          <w:p>
+            <w:pPr>
+              <w:spacing w:before="0" w:after="0"/>
+              <w:jc w:val="center"/>
+            </w:pPr>
+            <w:r>
+              <w:rPr>
+                <w:rFonts w:ascii="Times New Roman" w:hAnsi="Times New Roman"/>
+                <w:b/>
+                <w:sz w:val="20"/>
+              </w:rPr>
+              <w:t>SKILL CHECK 2</w:t>
+            </w:r>
+          </w:p>
+          <w:p>
+            <w:pPr>
+              <w:spacing w:before="0" w:after="120"/>
+              <w:jc w:val="center"/>
+            </w:pPr>
+            <w:r>
+              <w:rPr>
+                <w:rFonts w:ascii="Times New Roman" w:hAnsi="Times New Roman"/>
+                <w:sz w:val="20"/>
+              </w:rPr>
+              <w:t>Physics 1</w:t>
+            </w:r>
+          </w:p>
+          <w:p>
+            <w:pPr>
+              <w:spacing w:before="0" w:after="120"/>
+            </w:pPr>
+            <w:r>
+              <w:rPr>
+                <w:rFonts w:ascii="Times New Roman" w:hAnsi="Times New Roman"/>
+                <w:b/>
+                <w:sz w:val="20"/>
+              </w:rPr>
+              <w:t>Instructions:</w:t>
+            </w:r>
+            <w:r>
+              <w:rPr>
+                <w:rFonts w:ascii="Times New Roman" w:hAnsi="Times New Roman"/>
+                <w:sz w:val="20"/>
+              </w:rPr>
+              <w:t xml:space="preserve"> Do not write anything on this paper. Solve the problems using the Given-Required-Solution format. Show the isolation of the target variable before substituting any numerical values.</w:t>
+            </w:r>
+          </w:p>
+          <w:p>
+            <w:pPr>
+              <w:spacing w:before="0" w:after="120"/>
+            </w:pPr>
+            <w:r>
+              <w:rPr>
+                <w:rFonts w:ascii="Times New Roman" w:hAnsi="Times New Roman"/>
+                <w:sz w:val="20"/>
+              </w:rPr>
+              <w:t>1) A jet plane is cruising at 280 m/s when suddenly the pilot turns the engines to full throttle. After traveling 4.0 km, the jet moves with a speed of 380 m/s. What is the jet’s acceleration, assuming it to be a constant acceleration? [5 pts]</w:t>
+            </w:r>
+          </w:p>
+          <w:p>
+            <w:pPr>
+              <w:spacing w:before="0" w:after="0"/>
+            </w:pPr>
+            <w:r>
+              <w:rPr>
+                <w:rFonts w:ascii="Times New Roman" w:hAnsi="Times New Roman"/>
+                <w:sz w:val="20"/>
+              </w:rPr>
+              <w:t>2) How long, in seconds, does it take for the air in your lungs to accelerate from rest to 150 km/h, assuming a constant acceleration of 83 m/s²? [5 pts]</w:t>
+            </w:r>
+          </w:p>
+        </w:tc>
+        <w:tc>
+          <w:tcPr>
+            <w:tcW w:type="dxa" w:w="5760"/>
+            <w:tcMar>
+              <w:top w:w="80" w:type="dxa"/>
+              <w:bottom w:w="80" w:type="dxa"/>
+              <w:start w:w="120" w:type="dxa"/>
+              <w:end w:w="120" w:type="dxa"/>
+            </w:tcMar>
+          </w:tcPr>
+          <w:p>
+            <w:pPr>
+              <w:spacing w:before="0" w:after="0"/>
+              <w:jc w:val="right"/>
+            </w:pPr>
+            <w:r>
+              <w:rPr>
+                <w:rFonts w:ascii="Times New Roman" w:hAnsi="Times New Roman"/>
+                <w:sz w:val="20"/>
+              </w:rPr>
+              <w:t>Questionnaire No. PHYS1-SC2-36</w:t>
             </w:r>
           </w:p>
           <w:p>
@@ -2498,6 +3638,7 @@
         <w:jc w:val="center"/>
         <w:tblLook w:firstColumn="1" w:firstRow="1" w:lastColumn="0" w:lastRow="0" w:noHBand="0" w:noVBand="1" w:val="04A0"/>
         <w:tblW w:w="5000" w:type="pct"/>
+        <w:tblLayout w:type="fixed"/>
         <w:tblBorders>
           <w:top w:val="single" w:sz="12" w:space="0" w:color="000000"/>
           <w:left w:val="single" w:sz="12" w:space="0" w:color="000000"/>
@@ -2508,12 +3649,13 @@
         </w:tblBorders>
       </w:tblPr>
       <w:tblGrid>
-        <w:gridCol w:w="11674"/>
+        <w:gridCol w:w="5760"/>
+        <w:gridCol w:w="5760"/>
       </w:tblGrid>
       <w:tr>
         <w:tc>
           <w:tcPr>
-            <w:tcW w:type="dxa" w:w="11674"/>
+            <w:tcW w:type="dxa" w:w="5760"/>
             <w:tcMar>
               <w:top w:w="80" w:type="dxa"/>
               <w:bottom w:w="80" w:type="dxa"/>
@@ -2531,7 +3673,7 @@
                 <w:rFonts w:ascii="Times New Roman" w:hAnsi="Times New Roman"/>
                 <w:sz w:val="20"/>
               </w:rPr>
-              <w:t>Questionnaire No. PHYS1-SC2-25</w:t>
+              <w:t>Questionnaire No. PHYS1-SC2-37</w:t>
             </w:r>
           </w:p>
           <w:p>
@@ -2606,11 +3748,9 @@
             </w:r>
           </w:p>
         </w:tc>
-      </w:tr>
-      <w:tr>
         <w:tc>
           <w:tcPr>
-            <w:tcW w:type="dxa" w:w="11674"/>
+            <w:tcW w:type="dxa" w:w="5760"/>
             <w:tcMar>
               <w:top w:w="80" w:type="dxa"/>
               <w:bottom w:w="80" w:type="dxa"/>
@@ -2628,7 +3768,7 @@
                 <w:rFonts w:ascii="Times New Roman" w:hAnsi="Times New Roman"/>
                 <w:sz w:val="20"/>
               </w:rPr>
-              <w:t>Questionnaire No. PHYS1-SC2-26</w:t>
+              <w:t>Questionnaire No. PHYS1-SC2-38</w:t>
             </w:r>
           </w:p>
           <w:p>
@@ -2707,7 +3847,7 @@
       <w:tr>
         <w:tc>
           <w:tcPr>
-            <w:tcW w:type="dxa" w:w="11674"/>
+            <w:tcW w:type="dxa" w:w="5760"/>
             <w:tcMar>
               <w:top w:w="80" w:type="dxa"/>
               <w:bottom w:w="80" w:type="dxa"/>
@@ -2725,7 +3865,7 @@
                 <w:rFonts w:ascii="Times New Roman" w:hAnsi="Times New Roman"/>
                 <w:sz w:val="20"/>
               </w:rPr>
-              <w:t>Questionnaire No. PHYS1-SC2-27</w:t>
+              <w:t>Questionnaire No. PHYS1-SC2-39</w:t>
             </w:r>
           </w:p>
           <w:p>
@@ -2800,11 +3940,9 @@
             </w:r>
           </w:p>
         </w:tc>
-      </w:tr>
-      <w:tr>
         <w:tc>
           <w:tcPr>
-            <w:tcW w:type="dxa" w:w="11674"/>
+            <w:tcW w:type="dxa" w:w="5760"/>
             <w:tcMar>
               <w:top w:w="80" w:type="dxa"/>
               <w:bottom w:w="80" w:type="dxa"/>
@@ -2822,7 +3960,199 @@
                 <w:rFonts w:ascii="Times New Roman" w:hAnsi="Times New Roman"/>
                 <w:sz w:val="20"/>
               </w:rPr>
-              <w:t>Questionnaire No. PHYS1-SC2-28</w:t>
+              <w:t>Questionnaire No. PHYS1-SC2-40</w:t>
+            </w:r>
+          </w:p>
+          <w:p>
+            <w:pPr>
+              <w:spacing w:before="0" w:after="0"/>
+              <w:jc w:val="center"/>
+            </w:pPr>
+            <w:r>
+              <w:rPr>
+                <w:rFonts w:ascii="Times New Roman" w:hAnsi="Times New Roman"/>
+                <w:b/>
+                <w:sz w:val="20"/>
+              </w:rPr>
+              <w:t>SKILL CHECK 2</w:t>
+            </w:r>
+          </w:p>
+          <w:p>
+            <w:pPr>
+              <w:spacing w:before="0" w:after="120"/>
+              <w:jc w:val="center"/>
+            </w:pPr>
+            <w:r>
+              <w:rPr>
+                <w:rFonts w:ascii="Times New Roman" w:hAnsi="Times New Roman"/>
+                <w:sz w:val="20"/>
+              </w:rPr>
+              <w:t>Physics 1</w:t>
+            </w:r>
+          </w:p>
+          <w:p>
+            <w:pPr>
+              <w:spacing w:before="0" w:after="120"/>
+            </w:pPr>
+            <w:r>
+              <w:rPr>
+                <w:rFonts w:ascii="Times New Roman" w:hAnsi="Times New Roman"/>
+                <w:b/>
+                <w:sz w:val="20"/>
+              </w:rPr>
+              <w:t>Instructions:</w:t>
+            </w:r>
+            <w:r>
+              <w:rPr>
+                <w:rFonts w:ascii="Times New Roman" w:hAnsi="Times New Roman"/>
+                <w:sz w:val="20"/>
+              </w:rPr>
+              <w:t xml:space="preserve"> Do not write anything on this paper. Solve the problems using the Given-Required-Solution format. Show the isolation of the target variable before substituting any numerical values.</w:t>
+            </w:r>
+          </w:p>
+          <w:p>
+            <w:pPr>
+              <w:spacing w:before="0" w:after="120"/>
+            </w:pPr>
+            <w:r>
+              <w:rPr>
+                <w:rFonts w:ascii="Times New Roman" w:hAnsi="Times New Roman"/>
+                <w:sz w:val="20"/>
+              </w:rPr>
+              <w:t>1) A jet plane is cruising at 280 m/s when suddenly the pilot turns the engines to full throttle. After traveling 4.0 km, the jet moves with a speed of 380 m/s. What is the jet’s acceleration, assuming it to be a constant acceleration? [5 pts]</w:t>
+            </w:r>
+          </w:p>
+          <w:p>
+            <w:pPr>
+              <w:spacing w:before="0" w:after="0"/>
+            </w:pPr>
+            <w:r>
+              <w:rPr>
+                <w:rFonts w:ascii="Times New Roman" w:hAnsi="Times New Roman"/>
+                <w:sz w:val="20"/>
+              </w:rPr>
+              <w:t>2) How long, in seconds, does it take for the air in your lungs to accelerate from rest to 150 km/h, assuming a constant acceleration of 83 m/s²? [5 pts]</w:t>
+            </w:r>
+          </w:p>
+        </w:tc>
+      </w:tr>
+      <w:tr>
+        <w:tc>
+          <w:tcPr>
+            <w:tcW w:type="dxa" w:w="5760"/>
+            <w:tcMar>
+              <w:top w:w="80" w:type="dxa"/>
+              <w:bottom w:w="80" w:type="dxa"/>
+              <w:start w:w="120" w:type="dxa"/>
+              <w:end w:w="120" w:type="dxa"/>
+            </w:tcMar>
+          </w:tcPr>
+          <w:p>
+            <w:pPr>
+              <w:spacing w:before="0" w:after="0"/>
+              <w:jc w:val="right"/>
+            </w:pPr>
+            <w:r>
+              <w:rPr>
+                <w:rFonts w:ascii="Times New Roman" w:hAnsi="Times New Roman"/>
+                <w:sz w:val="20"/>
+              </w:rPr>
+              <w:t>Questionnaire No. PHYS1-SC2-41</w:t>
+            </w:r>
+          </w:p>
+          <w:p>
+            <w:pPr>
+              <w:spacing w:before="0" w:after="0"/>
+              <w:jc w:val="center"/>
+            </w:pPr>
+            <w:r>
+              <w:rPr>
+                <w:rFonts w:ascii="Times New Roman" w:hAnsi="Times New Roman"/>
+                <w:b/>
+                <w:sz w:val="20"/>
+              </w:rPr>
+              <w:t>SKILL CHECK 2</w:t>
+            </w:r>
+          </w:p>
+          <w:p>
+            <w:pPr>
+              <w:spacing w:before="0" w:after="120"/>
+              <w:jc w:val="center"/>
+            </w:pPr>
+            <w:r>
+              <w:rPr>
+                <w:rFonts w:ascii="Times New Roman" w:hAnsi="Times New Roman"/>
+                <w:sz w:val="20"/>
+              </w:rPr>
+              <w:t>Physics 1</w:t>
+            </w:r>
+          </w:p>
+          <w:p>
+            <w:pPr>
+              <w:spacing w:before="0" w:after="120"/>
+            </w:pPr>
+            <w:r>
+              <w:rPr>
+                <w:rFonts w:ascii="Times New Roman" w:hAnsi="Times New Roman"/>
+                <w:b/>
+                <w:sz w:val="20"/>
+              </w:rPr>
+              <w:t>Instructions:</w:t>
+            </w:r>
+            <w:r>
+              <w:rPr>
+                <w:rFonts w:ascii="Times New Roman" w:hAnsi="Times New Roman"/>
+                <w:sz w:val="20"/>
+              </w:rPr>
+              <w:t xml:space="preserve"> Do not write anything on this paper. Solve the problems using the Given-Required-Solution format. Show the isolation of the target variable before substituting any numerical values.</w:t>
+            </w:r>
+          </w:p>
+          <w:p>
+            <w:pPr>
+              <w:spacing w:before="0" w:after="120"/>
+            </w:pPr>
+            <w:r>
+              <w:rPr>
+                <w:rFonts w:ascii="Times New Roman" w:hAnsi="Times New Roman"/>
+                <w:sz w:val="20"/>
+              </w:rPr>
+              <w:t>1) A jet plane is cruising at 280 m/s when suddenly the pilot turns the engines to full throttle. After traveling 4.0 km, the jet moves with a speed of 380 m/s. What is the jet’s acceleration, assuming it to be a constant acceleration? [5 pts]</w:t>
+            </w:r>
+          </w:p>
+          <w:p>
+            <w:pPr>
+              <w:spacing w:before="0" w:after="0"/>
+            </w:pPr>
+            <w:r>
+              <w:rPr>
+                <w:rFonts w:ascii="Times New Roman" w:hAnsi="Times New Roman"/>
+                <w:sz w:val="20"/>
+              </w:rPr>
+              <w:t>2) How long, in seconds, does it take for the air in your lungs to accelerate from rest to 150 km/h, assuming a constant acceleration of 83 m/s²? [5 pts]</w:t>
+            </w:r>
+          </w:p>
+        </w:tc>
+        <w:tc>
+          <w:tcPr>
+            <w:tcW w:type="dxa" w:w="5760"/>
+            <w:tcMar>
+              <w:top w:w="80" w:type="dxa"/>
+              <w:bottom w:w="80" w:type="dxa"/>
+              <w:start w:w="120" w:type="dxa"/>
+              <w:end w:w="120" w:type="dxa"/>
+            </w:tcMar>
+          </w:tcPr>
+          <w:p>
+            <w:pPr>
+              <w:spacing w:before="0" w:after="0"/>
+              <w:jc w:val="right"/>
+            </w:pPr>
+            <w:r>
+              <w:rPr>
+                <w:rFonts w:ascii="Times New Roman" w:hAnsi="Times New Roman"/>
+                <w:sz w:val="20"/>
+              </w:rPr>
+              <w:t>Questionnaire No. PHYS1-SC2-42</w:t>
             </w:r>
           </w:p>
           <w:p>
@@ -2913,6 +4243,7 @@
         <w:jc w:val="center"/>
         <w:tblLook w:firstColumn="1" w:firstRow="1" w:lastColumn="0" w:lastRow="0" w:noHBand="0" w:noVBand="1" w:val="04A0"/>
         <w:tblW w:w="5000" w:type="pct"/>
+        <w:tblLayout w:type="fixed"/>
         <w:tblBorders>
           <w:top w:val="single" w:sz="12" w:space="0" w:color="000000"/>
           <w:left w:val="single" w:sz="12" w:space="0" w:color="000000"/>
@@ -2923,12 +4254,13 @@
         </w:tblBorders>
       </w:tblPr>
       <w:tblGrid>
-        <w:gridCol w:w="11674"/>
+        <w:gridCol w:w="5760"/>
+        <w:gridCol w:w="5760"/>
       </w:tblGrid>
       <w:tr>
         <w:tc>
           <w:tcPr>
-            <w:tcW w:type="dxa" w:w="11674"/>
+            <w:tcW w:type="dxa" w:w="5760"/>
             <w:tcMar>
               <w:top w:w="80" w:type="dxa"/>
               <w:bottom w:w="80" w:type="dxa"/>
@@ -2946,7 +4278,7 @@
                 <w:rFonts w:ascii="Times New Roman" w:hAnsi="Times New Roman"/>
                 <w:sz w:val="20"/>
               </w:rPr>
-              <w:t>Questionnaire No. PHYS1-SC2-29</w:t>
+              <w:t>Questionnaire No. PHYS1-SC2-43</w:t>
             </w:r>
           </w:p>
           <w:p>
@@ -3021,11 +4353,9 @@
             </w:r>
           </w:p>
         </w:tc>
-      </w:tr>
-      <w:tr>
         <w:tc>
           <w:tcPr>
-            <w:tcW w:type="dxa" w:w="11674"/>
+            <w:tcW w:type="dxa" w:w="5760"/>
             <w:tcMar>
               <w:top w:w="80" w:type="dxa"/>
               <w:bottom w:w="80" w:type="dxa"/>
@@ -3043,7 +4373,7 @@
                 <w:rFonts w:ascii="Times New Roman" w:hAnsi="Times New Roman"/>
                 <w:sz w:val="20"/>
               </w:rPr>
-              <w:t>Questionnaire No. PHYS1-SC2-30</w:t>
+              <w:t>Questionnaire No. PHYS1-SC2-44</w:t>
             </w:r>
           </w:p>
           <w:p>
@@ -3122,7 +4452,7 @@
       <w:tr>
         <w:tc>
           <w:tcPr>
-            <w:tcW w:type="dxa" w:w="11674"/>
+            <w:tcW w:type="dxa" w:w="5760"/>
             <w:tcMar>
               <w:top w:w="80" w:type="dxa"/>
               <w:bottom w:w="80" w:type="dxa"/>
@@ -3140,7 +4470,7 @@
                 <w:rFonts w:ascii="Times New Roman" w:hAnsi="Times New Roman"/>
                 <w:sz w:val="20"/>
               </w:rPr>
-              <w:t>Questionnaire No. PHYS1-SC2-31</w:t>
+              <w:t>Questionnaire No. PHYS1-SC2-45</w:t>
             </w:r>
           </w:p>
           <w:p>
@@ -3215,11 +4545,9 @@
             </w:r>
           </w:p>
         </w:tc>
-      </w:tr>
-      <w:tr>
         <w:tc>
           <w:tcPr>
-            <w:tcW w:type="dxa" w:w="11674"/>
+            <w:tcW w:type="dxa" w:w="5760"/>
             <w:tcMar>
               <w:top w:w="80" w:type="dxa"/>
               <w:bottom w:w="80" w:type="dxa"/>
@@ -3237,7 +4565,7 @@
                 <w:rFonts w:ascii="Times New Roman" w:hAnsi="Times New Roman"/>
                 <w:sz w:val="20"/>
               </w:rPr>
-              <w:t>Questionnaire No. PHYS1-SC2-32</w:t>
+              <w:t>Questionnaire No. PHYS1-SC2-46</w:t>
             </w:r>
           </w:p>
           <w:p>
@@ -3313,37 +4641,10 @@
           </w:p>
         </w:tc>
       </w:tr>
-    </w:tbl>
-    <w:p>
-      <w:pPr>
-        <w:spacing w:before="0" w:after="0"/>
-      </w:pPr>
-      <w:r>
-        <w:br w:type="page"/>
-      </w:r>
-    </w:p>
-    <w:tbl>
-      <w:tblPr>
-        <w:tblW w:type="auto" w:w="0"/>
-        <w:jc w:val="center"/>
-        <w:tblLook w:firstColumn="1" w:firstRow="1" w:lastColumn="0" w:lastRow="0" w:noHBand="0" w:noVBand="1" w:val="04A0"/>
-        <w:tblW w:w="5000" w:type="pct"/>
-        <w:tblBorders>
-          <w:top w:val="single" w:sz="12" w:space="0" w:color="000000"/>
-          <w:left w:val="single" w:sz="12" w:space="0" w:color="000000"/>
-          <w:bottom w:val="single" w:sz="12" w:space="0" w:color="000000"/>
-          <w:right w:val="single" w:sz="12" w:space="0" w:color="000000"/>
-          <w:insideH w:val="single" w:sz="12" w:space="0" w:color="000000"/>
-          <w:insideV w:val="single" w:sz="12" w:space="0" w:color="000000"/>
-        </w:tblBorders>
-      </w:tblPr>
-      <w:tblGrid>
-        <w:gridCol w:w="11674"/>
-      </w:tblGrid>
       <w:tr>
         <w:tc>
           <w:tcPr>
-            <w:tcW w:type="dxa" w:w="11674"/>
+            <w:tcW w:type="dxa" w:w="5760"/>
             <w:tcMar>
               <w:top w:w="80" w:type="dxa"/>
               <w:bottom w:w="80" w:type="dxa"/>
@@ -3361,7 +4662,7 @@
                 <w:rFonts w:ascii="Times New Roman" w:hAnsi="Times New Roman"/>
                 <w:sz w:val="20"/>
               </w:rPr>
-              <w:t>Questionnaire No. PHYS1-SC2-33</w:t>
+              <w:t>Questionnaire No. PHYS1-SC2-47</w:t>
             </w:r>
           </w:p>
           <w:p>
@@ -3436,1450 +4737,9 @@
             </w:r>
           </w:p>
         </w:tc>
-      </w:tr>
-      <w:tr>
         <w:tc>
           <w:tcPr>
-            <w:tcW w:type="dxa" w:w="11674"/>
-            <w:tcMar>
-              <w:top w:w="80" w:type="dxa"/>
-              <w:bottom w:w="80" w:type="dxa"/>
-              <w:start w:w="120" w:type="dxa"/>
-              <w:end w:w="120" w:type="dxa"/>
-            </w:tcMar>
-          </w:tcPr>
-          <w:p>
-            <w:pPr>
-              <w:spacing w:before="0" w:after="0"/>
-              <w:jc w:val="right"/>
-            </w:pPr>
-            <w:r>
-              <w:rPr>
-                <w:rFonts w:ascii="Times New Roman" w:hAnsi="Times New Roman"/>
-                <w:sz w:val="20"/>
-              </w:rPr>
-              <w:t>Questionnaire No. PHYS1-SC2-34</w:t>
-            </w:r>
-          </w:p>
-          <w:p>
-            <w:pPr>
-              <w:spacing w:before="0" w:after="0"/>
-              <w:jc w:val="center"/>
-            </w:pPr>
-            <w:r>
-              <w:rPr>
-                <w:rFonts w:ascii="Times New Roman" w:hAnsi="Times New Roman"/>
-                <w:b/>
-                <w:sz w:val="20"/>
-              </w:rPr>
-              <w:t>SKILL CHECK 2</w:t>
-            </w:r>
-          </w:p>
-          <w:p>
-            <w:pPr>
-              <w:spacing w:before="0" w:after="120"/>
-              <w:jc w:val="center"/>
-            </w:pPr>
-            <w:r>
-              <w:rPr>
-                <w:rFonts w:ascii="Times New Roman" w:hAnsi="Times New Roman"/>
-                <w:sz w:val="20"/>
-              </w:rPr>
-              <w:t>Physics 1</w:t>
-            </w:r>
-          </w:p>
-          <w:p>
-            <w:pPr>
-              <w:spacing w:before="0" w:after="120"/>
-            </w:pPr>
-            <w:r>
-              <w:rPr>
-                <w:rFonts w:ascii="Times New Roman" w:hAnsi="Times New Roman"/>
-                <w:b/>
-                <w:sz w:val="20"/>
-              </w:rPr>
-              <w:t>Instructions:</w:t>
-            </w:r>
-            <w:r>
-              <w:rPr>
-                <w:rFonts w:ascii="Times New Roman" w:hAnsi="Times New Roman"/>
-                <w:sz w:val="20"/>
-              </w:rPr>
-              <w:t xml:space="preserve"> Do not write anything on this paper. Solve the problems using the Given-Required-Solution format. Show the isolation of the target variable before substituting any numerical values.</w:t>
-            </w:r>
-          </w:p>
-          <w:p>
-            <w:pPr>
-              <w:spacing w:before="0" w:after="120"/>
-            </w:pPr>
-            <w:r>
-              <w:rPr>
-                <w:rFonts w:ascii="Times New Roman" w:hAnsi="Times New Roman"/>
-                <w:sz w:val="20"/>
-              </w:rPr>
-              <w:t>1) A jet plane is cruising at 280 m/s when suddenly the pilot turns the engines to full throttle. After traveling 4.0 km, the jet moves with a speed of 380 m/s. What is the jet’s acceleration, assuming it to be a constant acceleration? [5 pts]</w:t>
-            </w:r>
-          </w:p>
-          <w:p>
-            <w:pPr>
-              <w:spacing w:before="0" w:after="0"/>
-            </w:pPr>
-            <w:r>
-              <w:rPr>
-                <w:rFonts w:ascii="Times New Roman" w:hAnsi="Times New Roman"/>
-                <w:sz w:val="20"/>
-              </w:rPr>
-              <w:t>2) How long, in seconds, does it take for the air in your lungs to accelerate from rest to 150 km/h, assuming a constant acceleration of 83 m/s²? [5 pts]</w:t>
-            </w:r>
-          </w:p>
-        </w:tc>
-      </w:tr>
-      <w:tr>
-        <w:tc>
-          <w:tcPr>
-            <w:tcW w:type="dxa" w:w="11674"/>
-            <w:tcMar>
-              <w:top w:w="80" w:type="dxa"/>
-              <w:bottom w:w="80" w:type="dxa"/>
-              <w:start w:w="120" w:type="dxa"/>
-              <w:end w:w="120" w:type="dxa"/>
-            </w:tcMar>
-          </w:tcPr>
-          <w:p>
-            <w:pPr>
-              <w:spacing w:before="0" w:after="0"/>
-              <w:jc w:val="right"/>
-            </w:pPr>
-            <w:r>
-              <w:rPr>
-                <w:rFonts w:ascii="Times New Roman" w:hAnsi="Times New Roman"/>
-                <w:sz w:val="20"/>
-              </w:rPr>
-              <w:t>Questionnaire No. PHYS1-SC2-35</w:t>
-            </w:r>
-          </w:p>
-          <w:p>
-            <w:pPr>
-              <w:spacing w:before="0" w:after="0"/>
-              <w:jc w:val="center"/>
-            </w:pPr>
-            <w:r>
-              <w:rPr>
-                <w:rFonts w:ascii="Times New Roman" w:hAnsi="Times New Roman"/>
-                <w:b/>
-                <w:sz w:val="20"/>
-              </w:rPr>
-              <w:t>SKILL CHECK 2</w:t>
-            </w:r>
-          </w:p>
-          <w:p>
-            <w:pPr>
-              <w:spacing w:before="0" w:after="120"/>
-              <w:jc w:val="center"/>
-            </w:pPr>
-            <w:r>
-              <w:rPr>
-                <w:rFonts w:ascii="Times New Roman" w:hAnsi="Times New Roman"/>
-                <w:sz w:val="20"/>
-              </w:rPr>
-              <w:t>Physics 1</w:t>
-            </w:r>
-          </w:p>
-          <w:p>
-            <w:pPr>
-              <w:spacing w:before="0" w:after="120"/>
-            </w:pPr>
-            <w:r>
-              <w:rPr>
-                <w:rFonts w:ascii="Times New Roman" w:hAnsi="Times New Roman"/>
-                <w:b/>
-                <w:sz w:val="20"/>
-              </w:rPr>
-              <w:t>Instructions:</w:t>
-            </w:r>
-            <w:r>
-              <w:rPr>
-                <w:rFonts w:ascii="Times New Roman" w:hAnsi="Times New Roman"/>
-                <w:sz w:val="20"/>
-              </w:rPr>
-              <w:t xml:space="preserve"> Do not write anything on this paper. Solve the problems using the Given-Required-Solution format. Show the isolation of the target variable before substituting any numerical values.</w:t>
-            </w:r>
-          </w:p>
-          <w:p>
-            <w:pPr>
-              <w:spacing w:before="0" w:after="120"/>
-            </w:pPr>
-            <w:r>
-              <w:rPr>
-                <w:rFonts w:ascii="Times New Roman" w:hAnsi="Times New Roman"/>
-                <w:sz w:val="20"/>
-              </w:rPr>
-              <w:t>1) A jet plane is cruising at 280 m/s when suddenly the pilot turns the engines to full throttle. After traveling 4.0 km, the jet moves with a speed of 380 m/s. What is the jet’s acceleration, assuming it to be a constant acceleration? [5 pts]</w:t>
-            </w:r>
-          </w:p>
-          <w:p>
-            <w:pPr>
-              <w:spacing w:before="0" w:after="0"/>
-            </w:pPr>
-            <w:r>
-              <w:rPr>
-                <w:rFonts w:ascii="Times New Roman" w:hAnsi="Times New Roman"/>
-                <w:sz w:val="20"/>
-              </w:rPr>
-              <w:t>2) How long, in seconds, does it take for the air in your lungs to accelerate from rest to 150 km/h, assuming a constant acceleration of 83 m/s²? [5 pts]</w:t>
-            </w:r>
-          </w:p>
-        </w:tc>
-      </w:tr>
-      <w:tr>
-        <w:tc>
-          <w:tcPr>
-            <w:tcW w:type="dxa" w:w="11674"/>
-            <w:tcMar>
-              <w:top w:w="80" w:type="dxa"/>
-              <w:bottom w:w="80" w:type="dxa"/>
-              <w:start w:w="120" w:type="dxa"/>
-              <w:end w:w="120" w:type="dxa"/>
-            </w:tcMar>
-          </w:tcPr>
-          <w:p>
-            <w:pPr>
-              <w:spacing w:before="0" w:after="0"/>
-              <w:jc w:val="right"/>
-            </w:pPr>
-            <w:r>
-              <w:rPr>
-                <w:rFonts w:ascii="Times New Roman" w:hAnsi="Times New Roman"/>
-                <w:sz w:val="20"/>
-              </w:rPr>
-              <w:t>Questionnaire No. PHYS1-SC2-36</w:t>
-            </w:r>
-          </w:p>
-          <w:p>
-            <w:pPr>
-              <w:spacing w:before="0" w:after="0"/>
-              <w:jc w:val="center"/>
-            </w:pPr>
-            <w:r>
-              <w:rPr>
-                <w:rFonts w:ascii="Times New Roman" w:hAnsi="Times New Roman"/>
-                <w:b/>
-                <w:sz w:val="20"/>
-              </w:rPr>
-              <w:t>SKILL CHECK 2</w:t>
-            </w:r>
-          </w:p>
-          <w:p>
-            <w:pPr>
-              <w:spacing w:before="0" w:after="120"/>
-              <w:jc w:val="center"/>
-            </w:pPr>
-            <w:r>
-              <w:rPr>
-                <w:rFonts w:ascii="Times New Roman" w:hAnsi="Times New Roman"/>
-                <w:sz w:val="20"/>
-              </w:rPr>
-              <w:t>Physics 1</w:t>
-            </w:r>
-          </w:p>
-          <w:p>
-            <w:pPr>
-              <w:spacing w:before="0" w:after="120"/>
-            </w:pPr>
-            <w:r>
-              <w:rPr>
-                <w:rFonts w:ascii="Times New Roman" w:hAnsi="Times New Roman"/>
-                <w:b/>
-                <w:sz w:val="20"/>
-              </w:rPr>
-              <w:t>Instructions:</w:t>
-            </w:r>
-            <w:r>
-              <w:rPr>
-                <w:rFonts w:ascii="Times New Roman" w:hAnsi="Times New Roman"/>
-                <w:sz w:val="20"/>
-              </w:rPr>
-              <w:t xml:space="preserve"> Do not write anything on this paper. Solve the problems using the Given-Required-Solution format. Show the isolation of the target variable before substituting any numerical values.</w:t>
-            </w:r>
-          </w:p>
-          <w:p>
-            <w:pPr>
-              <w:spacing w:before="0" w:after="120"/>
-            </w:pPr>
-            <w:r>
-              <w:rPr>
-                <w:rFonts w:ascii="Times New Roman" w:hAnsi="Times New Roman"/>
-                <w:sz w:val="20"/>
-              </w:rPr>
-              <w:t>1) A jet plane is cruising at 280 m/s when suddenly the pilot turns the engines to full throttle. After traveling 4.0 km, the jet moves with a speed of 380 m/s. What is the jet’s acceleration, assuming it to be a constant acceleration? [5 pts]</w:t>
-            </w:r>
-          </w:p>
-          <w:p>
-            <w:pPr>
-              <w:spacing w:before="0" w:after="0"/>
-            </w:pPr>
-            <w:r>
-              <w:rPr>
-                <w:rFonts w:ascii="Times New Roman" w:hAnsi="Times New Roman"/>
-                <w:sz w:val="20"/>
-              </w:rPr>
-              <w:t>2) How long, in seconds, does it take for the air in your lungs to accelerate from rest to 150 km/h, assuming a constant acceleration of 83 m/s²? [5 pts]</w:t>
-            </w:r>
-          </w:p>
-        </w:tc>
-      </w:tr>
-    </w:tbl>
-    <w:p>
-      <w:pPr>
-        <w:spacing w:before="0" w:after="0"/>
-      </w:pPr>
-      <w:r>
-        <w:br w:type="page"/>
-      </w:r>
-    </w:p>
-    <w:tbl>
-      <w:tblPr>
-        <w:tblW w:type="auto" w:w="0"/>
-        <w:jc w:val="center"/>
-        <w:tblLook w:firstColumn="1" w:firstRow="1" w:lastColumn="0" w:lastRow="0" w:noHBand="0" w:noVBand="1" w:val="04A0"/>
-        <w:tblW w:w="5000" w:type="pct"/>
-        <w:tblBorders>
-          <w:top w:val="single" w:sz="12" w:space="0" w:color="000000"/>
-          <w:left w:val="single" w:sz="12" w:space="0" w:color="000000"/>
-          <w:bottom w:val="single" w:sz="12" w:space="0" w:color="000000"/>
-          <w:right w:val="single" w:sz="12" w:space="0" w:color="000000"/>
-          <w:insideH w:val="single" w:sz="12" w:space="0" w:color="000000"/>
-          <w:insideV w:val="single" w:sz="12" w:space="0" w:color="000000"/>
-        </w:tblBorders>
-      </w:tblPr>
-      <w:tblGrid>
-        <w:gridCol w:w="11674"/>
-      </w:tblGrid>
-      <w:tr>
-        <w:tc>
-          <w:tcPr>
-            <w:tcW w:type="dxa" w:w="11674"/>
-            <w:tcMar>
-              <w:top w:w="80" w:type="dxa"/>
-              <w:bottom w:w="80" w:type="dxa"/>
-              <w:start w:w="120" w:type="dxa"/>
-              <w:end w:w="120" w:type="dxa"/>
-            </w:tcMar>
-          </w:tcPr>
-          <w:p>
-            <w:pPr>
-              <w:spacing w:before="0" w:after="0"/>
-              <w:jc w:val="right"/>
-            </w:pPr>
-            <w:r>
-              <w:rPr>
-                <w:rFonts w:ascii="Times New Roman" w:hAnsi="Times New Roman"/>
-                <w:sz w:val="20"/>
-              </w:rPr>
-              <w:t>Questionnaire No. PHYS1-SC2-37</w:t>
-            </w:r>
-          </w:p>
-          <w:p>
-            <w:pPr>
-              <w:spacing w:before="0" w:after="0"/>
-              <w:jc w:val="center"/>
-            </w:pPr>
-            <w:r>
-              <w:rPr>
-                <w:rFonts w:ascii="Times New Roman" w:hAnsi="Times New Roman"/>
-                <w:b/>
-                <w:sz w:val="20"/>
-              </w:rPr>
-              <w:t>SKILL CHECK 2</w:t>
-            </w:r>
-          </w:p>
-          <w:p>
-            <w:pPr>
-              <w:spacing w:before="0" w:after="120"/>
-              <w:jc w:val="center"/>
-            </w:pPr>
-            <w:r>
-              <w:rPr>
-                <w:rFonts w:ascii="Times New Roman" w:hAnsi="Times New Roman"/>
-                <w:sz w:val="20"/>
-              </w:rPr>
-              <w:t>Physics 1</w:t>
-            </w:r>
-          </w:p>
-          <w:p>
-            <w:pPr>
-              <w:spacing w:before="0" w:after="120"/>
-            </w:pPr>
-            <w:r>
-              <w:rPr>
-                <w:rFonts w:ascii="Times New Roman" w:hAnsi="Times New Roman"/>
-                <w:b/>
-                <w:sz w:val="20"/>
-              </w:rPr>
-              <w:t>Instructions:</w:t>
-            </w:r>
-            <w:r>
-              <w:rPr>
-                <w:rFonts w:ascii="Times New Roman" w:hAnsi="Times New Roman"/>
-                <w:sz w:val="20"/>
-              </w:rPr>
-              <w:t xml:space="preserve"> Do not write anything on this paper. Solve the problems using the Given-Required-Solution format. Show the isolation of the target variable before substituting any numerical values.</w:t>
-            </w:r>
-          </w:p>
-          <w:p>
-            <w:pPr>
-              <w:spacing w:before="0" w:after="120"/>
-            </w:pPr>
-            <w:r>
-              <w:rPr>
-                <w:rFonts w:ascii="Times New Roman" w:hAnsi="Times New Roman"/>
-                <w:sz w:val="20"/>
-              </w:rPr>
-              <w:t>1) A jet plane is cruising at 280 m/s when suddenly the pilot turns the engines to full throttle. After traveling 4.0 km, the jet moves with a speed of 380 m/s. What is the jet’s acceleration, assuming it to be a constant acceleration? [5 pts]</w:t>
-            </w:r>
-          </w:p>
-          <w:p>
-            <w:pPr>
-              <w:spacing w:before="0" w:after="0"/>
-            </w:pPr>
-            <w:r>
-              <w:rPr>
-                <w:rFonts w:ascii="Times New Roman" w:hAnsi="Times New Roman"/>
-                <w:sz w:val="20"/>
-              </w:rPr>
-              <w:t>2) How long, in seconds, does it take for the air in your lungs to accelerate from rest to 150 km/h, assuming a constant acceleration of 83 m/s²? [5 pts]</w:t>
-            </w:r>
-          </w:p>
-        </w:tc>
-      </w:tr>
-      <w:tr>
-        <w:tc>
-          <w:tcPr>
-            <w:tcW w:type="dxa" w:w="11674"/>
-            <w:tcMar>
-              <w:top w:w="80" w:type="dxa"/>
-              <w:bottom w:w="80" w:type="dxa"/>
-              <w:start w:w="120" w:type="dxa"/>
-              <w:end w:w="120" w:type="dxa"/>
-            </w:tcMar>
-          </w:tcPr>
-          <w:p>
-            <w:pPr>
-              <w:spacing w:before="0" w:after="0"/>
-              <w:jc w:val="right"/>
-            </w:pPr>
-            <w:r>
-              <w:rPr>
-                <w:rFonts w:ascii="Times New Roman" w:hAnsi="Times New Roman"/>
-                <w:sz w:val="20"/>
-              </w:rPr>
-              <w:t>Questionnaire No. PHYS1-SC2-38</w:t>
-            </w:r>
-          </w:p>
-          <w:p>
-            <w:pPr>
-              <w:spacing w:before="0" w:after="0"/>
-              <w:jc w:val="center"/>
-            </w:pPr>
-            <w:r>
-              <w:rPr>
-                <w:rFonts w:ascii="Times New Roman" w:hAnsi="Times New Roman"/>
-                <w:b/>
-                <w:sz w:val="20"/>
-              </w:rPr>
-              <w:t>SKILL CHECK 2</w:t>
-            </w:r>
-          </w:p>
-          <w:p>
-            <w:pPr>
-              <w:spacing w:before="0" w:after="120"/>
-              <w:jc w:val="center"/>
-            </w:pPr>
-            <w:r>
-              <w:rPr>
-                <w:rFonts w:ascii="Times New Roman" w:hAnsi="Times New Roman"/>
-                <w:sz w:val="20"/>
-              </w:rPr>
-              <w:t>Physics 1</w:t>
-            </w:r>
-          </w:p>
-          <w:p>
-            <w:pPr>
-              <w:spacing w:before="0" w:after="120"/>
-            </w:pPr>
-            <w:r>
-              <w:rPr>
-                <w:rFonts w:ascii="Times New Roman" w:hAnsi="Times New Roman"/>
-                <w:b/>
-                <w:sz w:val="20"/>
-              </w:rPr>
-              <w:t>Instructions:</w:t>
-            </w:r>
-            <w:r>
-              <w:rPr>
-                <w:rFonts w:ascii="Times New Roman" w:hAnsi="Times New Roman"/>
-                <w:sz w:val="20"/>
-              </w:rPr>
-              <w:t xml:space="preserve"> Do not write anything on this paper. Solve the problems using the Given-Required-Solution format. Show the isolation of the target variable before substituting any numerical values.</w:t>
-            </w:r>
-          </w:p>
-          <w:p>
-            <w:pPr>
-              <w:spacing w:before="0" w:after="120"/>
-            </w:pPr>
-            <w:r>
-              <w:rPr>
-                <w:rFonts w:ascii="Times New Roman" w:hAnsi="Times New Roman"/>
-                <w:sz w:val="20"/>
-              </w:rPr>
-              <w:t>1) A jet plane is cruising at 280 m/s when suddenly the pilot turns the engines to full throttle. After traveling 4.0 km, the jet moves with a speed of 380 m/s. What is the jet’s acceleration, assuming it to be a constant acceleration? [5 pts]</w:t>
-            </w:r>
-          </w:p>
-          <w:p>
-            <w:pPr>
-              <w:spacing w:before="0" w:after="0"/>
-            </w:pPr>
-            <w:r>
-              <w:rPr>
-                <w:rFonts w:ascii="Times New Roman" w:hAnsi="Times New Roman"/>
-                <w:sz w:val="20"/>
-              </w:rPr>
-              <w:t>2) How long, in seconds, does it take for the air in your lungs to accelerate from rest to 150 km/h, assuming a constant acceleration of 83 m/s²? [5 pts]</w:t>
-            </w:r>
-          </w:p>
-        </w:tc>
-      </w:tr>
-      <w:tr>
-        <w:tc>
-          <w:tcPr>
-            <w:tcW w:type="dxa" w:w="11674"/>
-            <w:tcMar>
-              <w:top w:w="80" w:type="dxa"/>
-              <w:bottom w:w="80" w:type="dxa"/>
-              <w:start w:w="120" w:type="dxa"/>
-              <w:end w:w="120" w:type="dxa"/>
-            </w:tcMar>
-          </w:tcPr>
-          <w:p>
-            <w:pPr>
-              <w:spacing w:before="0" w:after="0"/>
-              <w:jc w:val="right"/>
-            </w:pPr>
-            <w:r>
-              <w:rPr>
-                <w:rFonts w:ascii="Times New Roman" w:hAnsi="Times New Roman"/>
-                <w:sz w:val="20"/>
-              </w:rPr>
-              <w:t>Questionnaire No. PHYS1-SC2-39</w:t>
-            </w:r>
-          </w:p>
-          <w:p>
-            <w:pPr>
-              <w:spacing w:before="0" w:after="0"/>
-              <w:jc w:val="center"/>
-            </w:pPr>
-            <w:r>
-              <w:rPr>
-                <w:rFonts w:ascii="Times New Roman" w:hAnsi="Times New Roman"/>
-                <w:b/>
-                <w:sz w:val="20"/>
-              </w:rPr>
-              <w:t>SKILL CHECK 2</w:t>
-            </w:r>
-          </w:p>
-          <w:p>
-            <w:pPr>
-              <w:spacing w:before="0" w:after="120"/>
-              <w:jc w:val="center"/>
-            </w:pPr>
-            <w:r>
-              <w:rPr>
-                <w:rFonts w:ascii="Times New Roman" w:hAnsi="Times New Roman"/>
-                <w:sz w:val="20"/>
-              </w:rPr>
-              <w:t>Physics 1</w:t>
-            </w:r>
-          </w:p>
-          <w:p>
-            <w:pPr>
-              <w:spacing w:before="0" w:after="120"/>
-            </w:pPr>
-            <w:r>
-              <w:rPr>
-                <w:rFonts w:ascii="Times New Roman" w:hAnsi="Times New Roman"/>
-                <w:b/>
-                <w:sz w:val="20"/>
-              </w:rPr>
-              <w:t>Instructions:</w:t>
-            </w:r>
-            <w:r>
-              <w:rPr>
-                <w:rFonts w:ascii="Times New Roman" w:hAnsi="Times New Roman"/>
-                <w:sz w:val="20"/>
-              </w:rPr>
-              <w:t xml:space="preserve"> Do not write anything on this paper. Solve the problems using the Given-Required-Solution format. Show the isolation of the target variable before substituting any numerical values.</w:t>
-            </w:r>
-          </w:p>
-          <w:p>
-            <w:pPr>
-              <w:spacing w:before="0" w:after="120"/>
-            </w:pPr>
-            <w:r>
-              <w:rPr>
-                <w:rFonts w:ascii="Times New Roman" w:hAnsi="Times New Roman"/>
-                <w:sz w:val="20"/>
-              </w:rPr>
-              <w:t>1) A jet plane is cruising at 280 m/s when suddenly the pilot turns the engines to full throttle. After traveling 4.0 km, the jet moves with a speed of 380 m/s. What is the jet’s acceleration, assuming it to be a constant acceleration? [5 pts]</w:t>
-            </w:r>
-          </w:p>
-          <w:p>
-            <w:pPr>
-              <w:spacing w:before="0" w:after="0"/>
-            </w:pPr>
-            <w:r>
-              <w:rPr>
-                <w:rFonts w:ascii="Times New Roman" w:hAnsi="Times New Roman"/>
-                <w:sz w:val="20"/>
-              </w:rPr>
-              <w:t>2) How long, in seconds, does it take for the air in your lungs to accelerate from rest to 150 km/h, assuming a constant acceleration of 83 m/s²? [5 pts]</w:t>
-            </w:r>
-          </w:p>
-        </w:tc>
-      </w:tr>
-      <w:tr>
-        <w:tc>
-          <w:tcPr>
-            <w:tcW w:type="dxa" w:w="11674"/>
-            <w:tcMar>
-              <w:top w:w="80" w:type="dxa"/>
-              <w:bottom w:w="80" w:type="dxa"/>
-              <w:start w:w="120" w:type="dxa"/>
-              <w:end w:w="120" w:type="dxa"/>
-            </w:tcMar>
-          </w:tcPr>
-          <w:p>
-            <w:pPr>
-              <w:spacing w:before="0" w:after="0"/>
-              <w:jc w:val="right"/>
-            </w:pPr>
-            <w:r>
-              <w:rPr>
-                <w:rFonts w:ascii="Times New Roman" w:hAnsi="Times New Roman"/>
-                <w:sz w:val="20"/>
-              </w:rPr>
-              <w:t>Questionnaire No. PHYS1-SC2-40</w:t>
-            </w:r>
-          </w:p>
-          <w:p>
-            <w:pPr>
-              <w:spacing w:before="0" w:after="0"/>
-              <w:jc w:val="center"/>
-            </w:pPr>
-            <w:r>
-              <w:rPr>
-                <w:rFonts w:ascii="Times New Roman" w:hAnsi="Times New Roman"/>
-                <w:b/>
-                <w:sz w:val="20"/>
-              </w:rPr>
-              <w:t>SKILL CHECK 2</w:t>
-            </w:r>
-          </w:p>
-          <w:p>
-            <w:pPr>
-              <w:spacing w:before="0" w:after="120"/>
-              <w:jc w:val="center"/>
-            </w:pPr>
-            <w:r>
-              <w:rPr>
-                <w:rFonts w:ascii="Times New Roman" w:hAnsi="Times New Roman"/>
-                <w:sz w:val="20"/>
-              </w:rPr>
-              <w:t>Physics 1</w:t>
-            </w:r>
-          </w:p>
-          <w:p>
-            <w:pPr>
-              <w:spacing w:before="0" w:after="120"/>
-            </w:pPr>
-            <w:r>
-              <w:rPr>
-                <w:rFonts w:ascii="Times New Roman" w:hAnsi="Times New Roman"/>
-                <w:b/>
-                <w:sz w:val="20"/>
-              </w:rPr>
-              <w:t>Instructions:</w:t>
-            </w:r>
-            <w:r>
-              <w:rPr>
-                <w:rFonts w:ascii="Times New Roman" w:hAnsi="Times New Roman"/>
-                <w:sz w:val="20"/>
-              </w:rPr>
-              <w:t xml:space="preserve"> Do not write anything on this paper. Solve the problems using the Given-Required-Solution format. Show the isolation of the target variable before substituting any numerical values.</w:t>
-            </w:r>
-          </w:p>
-          <w:p>
-            <w:pPr>
-              <w:spacing w:before="0" w:after="120"/>
-            </w:pPr>
-            <w:r>
-              <w:rPr>
-                <w:rFonts w:ascii="Times New Roman" w:hAnsi="Times New Roman"/>
-                <w:sz w:val="20"/>
-              </w:rPr>
-              <w:t>1) A jet plane is cruising at 280 m/s when suddenly the pilot turns the engines to full throttle. After traveling 4.0 km, the jet moves with a speed of 380 m/s. What is the jet’s acceleration, assuming it to be a constant acceleration? [5 pts]</w:t>
-            </w:r>
-          </w:p>
-          <w:p>
-            <w:pPr>
-              <w:spacing w:before="0" w:after="0"/>
-            </w:pPr>
-            <w:r>
-              <w:rPr>
-                <w:rFonts w:ascii="Times New Roman" w:hAnsi="Times New Roman"/>
-                <w:sz w:val="20"/>
-              </w:rPr>
-              <w:t>2) How long, in seconds, does it take for the air in your lungs to accelerate from rest to 150 km/h, assuming a constant acceleration of 83 m/s²? [5 pts]</w:t>
-            </w:r>
-          </w:p>
-        </w:tc>
-      </w:tr>
-    </w:tbl>
-    <w:p>
-      <w:pPr>
-        <w:spacing w:before="0" w:after="0"/>
-      </w:pPr>
-      <w:r>
-        <w:br w:type="page"/>
-      </w:r>
-    </w:p>
-    <w:tbl>
-      <w:tblPr>
-        <w:tblW w:type="auto" w:w="0"/>
-        <w:jc w:val="center"/>
-        <w:tblLook w:firstColumn="1" w:firstRow="1" w:lastColumn="0" w:lastRow="0" w:noHBand="0" w:noVBand="1" w:val="04A0"/>
-        <w:tblW w:w="5000" w:type="pct"/>
-        <w:tblBorders>
-          <w:top w:val="single" w:sz="12" w:space="0" w:color="000000"/>
-          <w:left w:val="single" w:sz="12" w:space="0" w:color="000000"/>
-          <w:bottom w:val="single" w:sz="12" w:space="0" w:color="000000"/>
-          <w:right w:val="single" w:sz="12" w:space="0" w:color="000000"/>
-          <w:insideH w:val="single" w:sz="12" w:space="0" w:color="000000"/>
-          <w:insideV w:val="single" w:sz="12" w:space="0" w:color="000000"/>
-        </w:tblBorders>
-      </w:tblPr>
-      <w:tblGrid>
-        <w:gridCol w:w="11674"/>
-      </w:tblGrid>
-      <w:tr>
-        <w:tc>
-          <w:tcPr>
-            <w:tcW w:type="dxa" w:w="11674"/>
-            <w:tcMar>
-              <w:top w:w="80" w:type="dxa"/>
-              <w:bottom w:w="80" w:type="dxa"/>
-              <w:start w:w="120" w:type="dxa"/>
-              <w:end w:w="120" w:type="dxa"/>
-            </w:tcMar>
-          </w:tcPr>
-          <w:p>
-            <w:pPr>
-              <w:spacing w:before="0" w:after="0"/>
-              <w:jc w:val="right"/>
-            </w:pPr>
-            <w:r>
-              <w:rPr>
-                <w:rFonts w:ascii="Times New Roman" w:hAnsi="Times New Roman"/>
-                <w:sz w:val="20"/>
-              </w:rPr>
-              <w:t>Questionnaire No. PHYS1-SC2-41</w:t>
-            </w:r>
-          </w:p>
-          <w:p>
-            <w:pPr>
-              <w:spacing w:before="0" w:after="0"/>
-              <w:jc w:val="center"/>
-            </w:pPr>
-            <w:r>
-              <w:rPr>
-                <w:rFonts w:ascii="Times New Roman" w:hAnsi="Times New Roman"/>
-                <w:b/>
-                <w:sz w:val="20"/>
-              </w:rPr>
-              <w:t>SKILL CHECK 2</w:t>
-            </w:r>
-          </w:p>
-          <w:p>
-            <w:pPr>
-              <w:spacing w:before="0" w:after="120"/>
-              <w:jc w:val="center"/>
-            </w:pPr>
-            <w:r>
-              <w:rPr>
-                <w:rFonts w:ascii="Times New Roman" w:hAnsi="Times New Roman"/>
-                <w:sz w:val="20"/>
-              </w:rPr>
-              <w:t>Physics 1</w:t>
-            </w:r>
-          </w:p>
-          <w:p>
-            <w:pPr>
-              <w:spacing w:before="0" w:after="120"/>
-            </w:pPr>
-            <w:r>
-              <w:rPr>
-                <w:rFonts w:ascii="Times New Roman" w:hAnsi="Times New Roman"/>
-                <w:b/>
-                <w:sz w:val="20"/>
-              </w:rPr>
-              <w:t>Instructions:</w:t>
-            </w:r>
-            <w:r>
-              <w:rPr>
-                <w:rFonts w:ascii="Times New Roman" w:hAnsi="Times New Roman"/>
-                <w:sz w:val="20"/>
-              </w:rPr>
-              <w:t xml:space="preserve"> Do not write anything on this paper. Solve the problems using the Given-Required-Solution format. Show the isolation of the target variable before substituting any numerical values.</w:t>
-            </w:r>
-          </w:p>
-          <w:p>
-            <w:pPr>
-              <w:spacing w:before="0" w:after="120"/>
-            </w:pPr>
-            <w:r>
-              <w:rPr>
-                <w:rFonts w:ascii="Times New Roman" w:hAnsi="Times New Roman"/>
-                <w:sz w:val="20"/>
-              </w:rPr>
-              <w:t>1) A jet plane is cruising at 280 m/s when suddenly the pilot turns the engines to full throttle. After traveling 4.0 km, the jet moves with a speed of 380 m/s. What is the jet’s acceleration, assuming it to be a constant acceleration? [5 pts]</w:t>
-            </w:r>
-          </w:p>
-          <w:p>
-            <w:pPr>
-              <w:spacing w:before="0" w:after="0"/>
-            </w:pPr>
-            <w:r>
-              <w:rPr>
-                <w:rFonts w:ascii="Times New Roman" w:hAnsi="Times New Roman"/>
-                <w:sz w:val="20"/>
-              </w:rPr>
-              <w:t>2) How long, in seconds, does it take for the air in your lungs to accelerate from rest to 150 km/h, assuming a constant acceleration of 83 m/s²? [5 pts]</w:t>
-            </w:r>
-          </w:p>
-        </w:tc>
-      </w:tr>
-      <w:tr>
-        <w:tc>
-          <w:tcPr>
-            <w:tcW w:type="dxa" w:w="11674"/>
-            <w:tcMar>
-              <w:top w:w="80" w:type="dxa"/>
-              <w:bottom w:w="80" w:type="dxa"/>
-              <w:start w:w="120" w:type="dxa"/>
-              <w:end w:w="120" w:type="dxa"/>
-            </w:tcMar>
-          </w:tcPr>
-          <w:p>
-            <w:pPr>
-              <w:spacing w:before="0" w:after="0"/>
-              <w:jc w:val="right"/>
-            </w:pPr>
-            <w:r>
-              <w:rPr>
-                <w:rFonts w:ascii="Times New Roman" w:hAnsi="Times New Roman"/>
-                <w:sz w:val="20"/>
-              </w:rPr>
-              <w:t>Questionnaire No. PHYS1-SC2-42</w:t>
-            </w:r>
-          </w:p>
-          <w:p>
-            <w:pPr>
-              <w:spacing w:before="0" w:after="0"/>
-              <w:jc w:val="center"/>
-            </w:pPr>
-            <w:r>
-              <w:rPr>
-                <w:rFonts w:ascii="Times New Roman" w:hAnsi="Times New Roman"/>
-                <w:b/>
-                <w:sz w:val="20"/>
-              </w:rPr>
-              <w:t>SKILL CHECK 2</w:t>
-            </w:r>
-          </w:p>
-          <w:p>
-            <w:pPr>
-              <w:spacing w:before="0" w:after="120"/>
-              <w:jc w:val="center"/>
-            </w:pPr>
-            <w:r>
-              <w:rPr>
-                <w:rFonts w:ascii="Times New Roman" w:hAnsi="Times New Roman"/>
-                <w:sz w:val="20"/>
-              </w:rPr>
-              <w:t>Physics 1</w:t>
-            </w:r>
-          </w:p>
-          <w:p>
-            <w:pPr>
-              <w:spacing w:before="0" w:after="120"/>
-            </w:pPr>
-            <w:r>
-              <w:rPr>
-                <w:rFonts w:ascii="Times New Roman" w:hAnsi="Times New Roman"/>
-                <w:b/>
-                <w:sz w:val="20"/>
-              </w:rPr>
-              <w:t>Instructions:</w:t>
-            </w:r>
-            <w:r>
-              <w:rPr>
-                <w:rFonts w:ascii="Times New Roman" w:hAnsi="Times New Roman"/>
-                <w:sz w:val="20"/>
-              </w:rPr>
-              <w:t xml:space="preserve"> Do not write anything on this paper. Solve the problems using the Given-Required-Solution format. Show the isolation of the target variable before substituting any numerical values.</w:t>
-            </w:r>
-          </w:p>
-          <w:p>
-            <w:pPr>
-              <w:spacing w:before="0" w:after="120"/>
-            </w:pPr>
-            <w:r>
-              <w:rPr>
-                <w:rFonts w:ascii="Times New Roman" w:hAnsi="Times New Roman"/>
-                <w:sz w:val="20"/>
-              </w:rPr>
-              <w:t>1) A jet plane is cruising at 280 m/s when suddenly the pilot turns the engines to full throttle. After traveling 4.0 km, the jet moves with a speed of 380 m/s. What is the jet’s acceleration, assuming it to be a constant acceleration? [5 pts]</w:t>
-            </w:r>
-          </w:p>
-          <w:p>
-            <w:pPr>
-              <w:spacing w:before="0" w:after="0"/>
-            </w:pPr>
-            <w:r>
-              <w:rPr>
-                <w:rFonts w:ascii="Times New Roman" w:hAnsi="Times New Roman"/>
-                <w:sz w:val="20"/>
-              </w:rPr>
-              <w:t>2) How long, in seconds, does it take for the air in your lungs to accelerate from rest to 150 km/h, assuming a constant acceleration of 83 m/s²? [5 pts]</w:t>
-            </w:r>
-          </w:p>
-        </w:tc>
-      </w:tr>
-      <w:tr>
-        <w:tc>
-          <w:tcPr>
-            <w:tcW w:type="dxa" w:w="11674"/>
-            <w:tcMar>
-              <w:top w:w="80" w:type="dxa"/>
-              <w:bottom w:w="80" w:type="dxa"/>
-              <w:start w:w="120" w:type="dxa"/>
-              <w:end w:w="120" w:type="dxa"/>
-            </w:tcMar>
-          </w:tcPr>
-          <w:p>
-            <w:pPr>
-              <w:spacing w:before="0" w:after="0"/>
-              <w:jc w:val="right"/>
-            </w:pPr>
-            <w:r>
-              <w:rPr>
-                <w:rFonts w:ascii="Times New Roman" w:hAnsi="Times New Roman"/>
-                <w:sz w:val="20"/>
-              </w:rPr>
-              <w:t>Questionnaire No. PHYS1-SC2-43</w:t>
-            </w:r>
-          </w:p>
-          <w:p>
-            <w:pPr>
-              <w:spacing w:before="0" w:after="0"/>
-              <w:jc w:val="center"/>
-            </w:pPr>
-            <w:r>
-              <w:rPr>
-                <w:rFonts w:ascii="Times New Roman" w:hAnsi="Times New Roman"/>
-                <w:b/>
-                <w:sz w:val="20"/>
-              </w:rPr>
-              <w:t>SKILL CHECK 2</w:t>
-            </w:r>
-          </w:p>
-          <w:p>
-            <w:pPr>
-              <w:spacing w:before="0" w:after="120"/>
-              <w:jc w:val="center"/>
-            </w:pPr>
-            <w:r>
-              <w:rPr>
-                <w:rFonts w:ascii="Times New Roman" w:hAnsi="Times New Roman"/>
-                <w:sz w:val="20"/>
-              </w:rPr>
-              <w:t>Physics 1</w:t>
-            </w:r>
-          </w:p>
-          <w:p>
-            <w:pPr>
-              <w:spacing w:before="0" w:after="120"/>
-            </w:pPr>
-            <w:r>
-              <w:rPr>
-                <w:rFonts w:ascii="Times New Roman" w:hAnsi="Times New Roman"/>
-                <w:b/>
-                <w:sz w:val="20"/>
-              </w:rPr>
-              <w:t>Instructions:</w:t>
-            </w:r>
-            <w:r>
-              <w:rPr>
-                <w:rFonts w:ascii="Times New Roman" w:hAnsi="Times New Roman"/>
-                <w:sz w:val="20"/>
-              </w:rPr>
-              <w:t xml:space="preserve"> Do not write anything on this paper. Solve the problems using the Given-Required-Solution format. Show the isolation of the target variable before substituting any numerical values.</w:t>
-            </w:r>
-          </w:p>
-          <w:p>
-            <w:pPr>
-              <w:spacing w:before="0" w:after="120"/>
-            </w:pPr>
-            <w:r>
-              <w:rPr>
-                <w:rFonts w:ascii="Times New Roman" w:hAnsi="Times New Roman"/>
-                <w:sz w:val="20"/>
-              </w:rPr>
-              <w:t>1) A jet plane is cruising at 280 m/s when suddenly the pilot turns the engines to full throttle. After traveling 4.0 km, the jet moves with a speed of 380 m/s. What is the jet’s acceleration, assuming it to be a constant acceleration? [5 pts]</w:t>
-            </w:r>
-          </w:p>
-          <w:p>
-            <w:pPr>
-              <w:spacing w:before="0" w:after="0"/>
-            </w:pPr>
-            <w:r>
-              <w:rPr>
-                <w:rFonts w:ascii="Times New Roman" w:hAnsi="Times New Roman"/>
-                <w:sz w:val="20"/>
-              </w:rPr>
-              <w:t>2) How long, in seconds, does it take for the air in your lungs to accelerate from rest to 150 km/h, assuming a constant acceleration of 83 m/s²? [5 pts]</w:t>
-            </w:r>
-          </w:p>
-        </w:tc>
-      </w:tr>
-      <w:tr>
-        <w:tc>
-          <w:tcPr>
-            <w:tcW w:type="dxa" w:w="11674"/>
-            <w:tcMar>
-              <w:top w:w="80" w:type="dxa"/>
-              <w:bottom w:w="80" w:type="dxa"/>
-              <w:start w:w="120" w:type="dxa"/>
-              <w:end w:w="120" w:type="dxa"/>
-            </w:tcMar>
-          </w:tcPr>
-          <w:p>
-            <w:pPr>
-              <w:spacing w:before="0" w:after="0"/>
-              <w:jc w:val="right"/>
-            </w:pPr>
-            <w:r>
-              <w:rPr>
-                <w:rFonts w:ascii="Times New Roman" w:hAnsi="Times New Roman"/>
-                <w:sz w:val="20"/>
-              </w:rPr>
-              <w:t>Questionnaire No. PHYS1-SC2-44</w:t>
-            </w:r>
-          </w:p>
-          <w:p>
-            <w:pPr>
-              <w:spacing w:before="0" w:after="0"/>
-              <w:jc w:val="center"/>
-            </w:pPr>
-            <w:r>
-              <w:rPr>
-                <w:rFonts w:ascii="Times New Roman" w:hAnsi="Times New Roman"/>
-                <w:b/>
-                <w:sz w:val="20"/>
-              </w:rPr>
-              <w:t>SKILL CHECK 2</w:t>
-            </w:r>
-          </w:p>
-          <w:p>
-            <w:pPr>
-              <w:spacing w:before="0" w:after="120"/>
-              <w:jc w:val="center"/>
-            </w:pPr>
-            <w:r>
-              <w:rPr>
-                <w:rFonts w:ascii="Times New Roman" w:hAnsi="Times New Roman"/>
-                <w:sz w:val="20"/>
-              </w:rPr>
-              <w:t>Physics 1</w:t>
-            </w:r>
-          </w:p>
-          <w:p>
-            <w:pPr>
-              <w:spacing w:before="0" w:after="120"/>
-            </w:pPr>
-            <w:r>
-              <w:rPr>
-                <w:rFonts w:ascii="Times New Roman" w:hAnsi="Times New Roman"/>
-                <w:b/>
-                <w:sz w:val="20"/>
-              </w:rPr>
-              <w:t>Instructions:</w:t>
-            </w:r>
-            <w:r>
-              <w:rPr>
-                <w:rFonts w:ascii="Times New Roman" w:hAnsi="Times New Roman"/>
-                <w:sz w:val="20"/>
-              </w:rPr>
-              <w:t xml:space="preserve"> Do not write anything on this paper. Solve the problems using the Given-Required-Solution format. Show the isolation of the target variable before substituting any numerical values.</w:t>
-            </w:r>
-          </w:p>
-          <w:p>
-            <w:pPr>
-              <w:spacing w:before="0" w:after="120"/>
-            </w:pPr>
-            <w:r>
-              <w:rPr>
-                <w:rFonts w:ascii="Times New Roman" w:hAnsi="Times New Roman"/>
-                <w:sz w:val="20"/>
-              </w:rPr>
-              <w:t>1) A jet plane is cruising at 280 m/s when suddenly the pilot turns the engines to full throttle. After traveling 4.0 km, the jet moves with a speed of 380 m/s. What is the jet’s acceleration, assuming it to be a constant acceleration? [5 pts]</w:t>
-            </w:r>
-          </w:p>
-          <w:p>
-            <w:pPr>
-              <w:spacing w:before="0" w:after="0"/>
-            </w:pPr>
-            <w:r>
-              <w:rPr>
-                <w:rFonts w:ascii="Times New Roman" w:hAnsi="Times New Roman"/>
-                <w:sz w:val="20"/>
-              </w:rPr>
-              <w:t>2) How long, in seconds, does it take for the air in your lungs to accelerate from rest to 150 km/h, assuming a constant acceleration of 83 m/s²? [5 pts]</w:t>
-            </w:r>
-          </w:p>
-        </w:tc>
-      </w:tr>
-    </w:tbl>
-    <w:p>
-      <w:pPr>
-        <w:spacing w:before="0" w:after="0"/>
-      </w:pPr>
-      <w:r>
-        <w:br w:type="page"/>
-      </w:r>
-    </w:p>
-    <w:tbl>
-      <w:tblPr>
-        <w:tblW w:type="auto" w:w="0"/>
-        <w:jc w:val="center"/>
-        <w:tblLook w:firstColumn="1" w:firstRow="1" w:lastColumn="0" w:lastRow="0" w:noHBand="0" w:noVBand="1" w:val="04A0"/>
-        <w:tblW w:w="5000" w:type="pct"/>
-        <w:tblBorders>
-          <w:top w:val="single" w:sz="12" w:space="0" w:color="000000"/>
-          <w:left w:val="single" w:sz="12" w:space="0" w:color="000000"/>
-          <w:bottom w:val="single" w:sz="12" w:space="0" w:color="000000"/>
-          <w:right w:val="single" w:sz="12" w:space="0" w:color="000000"/>
-          <w:insideH w:val="single" w:sz="12" w:space="0" w:color="000000"/>
-          <w:insideV w:val="single" w:sz="12" w:space="0" w:color="000000"/>
-        </w:tblBorders>
-      </w:tblPr>
-      <w:tblGrid>
-        <w:gridCol w:w="11674"/>
-      </w:tblGrid>
-      <w:tr>
-        <w:tc>
-          <w:tcPr>
-            <w:tcW w:type="dxa" w:w="11674"/>
-            <w:tcMar>
-              <w:top w:w="80" w:type="dxa"/>
-              <w:bottom w:w="80" w:type="dxa"/>
-              <w:start w:w="120" w:type="dxa"/>
-              <w:end w:w="120" w:type="dxa"/>
-            </w:tcMar>
-          </w:tcPr>
-          <w:p>
-            <w:pPr>
-              <w:spacing w:before="0" w:after="0"/>
-              <w:jc w:val="right"/>
-            </w:pPr>
-            <w:r>
-              <w:rPr>
-                <w:rFonts w:ascii="Times New Roman" w:hAnsi="Times New Roman"/>
-                <w:sz w:val="20"/>
-              </w:rPr>
-              <w:t>Questionnaire No. PHYS1-SC2-45</w:t>
-            </w:r>
-          </w:p>
-          <w:p>
-            <w:pPr>
-              <w:spacing w:before="0" w:after="0"/>
-              <w:jc w:val="center"/>
-            </w:pPr>
-            <w:r>
-              <w:rPr>
-                <w:rFonts w:ascii="Times New Roman" w:hAnsi="Times New Roman"/>
-                <w:b/>
-                <w:sz w:val="20"/>
-              </w:rPr>
-              <w:t>SKILL CHECK 2</w:t>
-            </w:r>
-          </w:p>
-          <w:p>
-            <w:pPr>
-              <w:spacing w:before="0" w:after="120"/>
-              <w:jc w:val="center"/>
-            </w:pPr>
-            <w:r>
-              <w:rPr>
-                <w:rFonts w:ascii="Times New Roman" w:hAnsi="Times New Roman"/>
-                <w:sz w:val="20"/>
-              </w:rPr>
-              <w:t>Physics 1</w:t>
-            </w:r>
-          </w:p>
-          <w:p>
-            <w:pPr>
-              <w:spacing w:before="0" w:after="120"/>
-            </w:pPr>
-            <w:r>
-              <w:rPr>
-                <w:rFonts w:ascii="Times New Roman" w:hAnsi="Times New Roman"/>
-                <w:b/>
-                <w:sz w:val="20"/>
-              </w:rPr>
-              <w:t>Instructions:</w:t>
-            </w:r>
-            <w:r>
-              <w:rPr>
-                <w:rFonts w:ascii="Times New Roman" w:hAnsi="Times New Roman"/>
-                <w:sz w:val="20"/>
-              </w:rPr>
-              <w:t xml:space="preserve"> Do not write anything on this paper. Solve the problems using the Given-Required-Solution format. Show the isolation of the target variable before substituting any numerical values.</w:t>
-            </w:r>
-          </w:p>
-          <w:p>
-            <w:pPr>
-              <w:spacing w:before="0" w:after="120"/>
-            </w:pPr>
-            <w:r>
-              <w:rPr>
-                <w:rFonts w:ascii="Times New Roman" w:hAnsi="Times New Roman"/>
-                <w:sz w:val="20"/>
-              </w:rPr>
-              <w:t>1) A jet plane is cruising at 280 m/s when suddenly the pilot turns the engines to full throttle. After traveling 4.0 km, the jet moves with a speed of 380 m/s. What is the jet’s acceleration, assuming it to be a constant acceleration? [5 pts]</w:t>
-            </w:r>
-          </w:p>
-          <w:p>
-            <w:pPr>
-              <w:spacing w:before="0" w:after="0"/>
-            </w:pPr>
-            <w:r>
-              <w:rPr>
-                <w:rFonts w:ascii="Times New Roman" w:hAnsi="Times New Roman"/>
-                <w:sz w:val="20"/>
-              </w:rPr>
-              <w:t>2) How long, in seconds, does it take for the air in your lungs to accelerate from rest to 150 km/h, assuming a constant acceleration of 83 m/s²? [5 pts]</w:t>
-            </w:r>
-          </w:p>
-        </w:tc>
-      </w:tr>
-      <w:tr>
-        <w:tc>
-          <w:tcPr>
-            <w:tcW w:type="dxa" w:w="11674"/>
-            <w:tcMar>
-              <w:top w:w="80" w:type="dxa"/>
-              <w:bottom w:w="80" w:type="dxa"/>
-              <w:start w:w="120" w:type="dxa"/>
-              <w:end w:w="120" w:type="dxa"/>
-            </w:tcMar>
-          </w:tcPr>
-          <w:p>
-            <w:pPr>
-              <w:spacing w:before="0" w:after="0"/>
-              <w:jc w:val="right"/>
-            </w:pPr>
-            <w:r>
-              <w:rPr>
-                <w:rFonts w:ascii="Times New Roman" w:hAnsi="Times New Roman"/>
-                <w:sz w:val="20"/>
-              </w:rPr>
-              <w:t>Questionnaire No. PHYS1-SC2-46</w:t>
-            </w:r>
-          </w:p>
-          <w:p>
-            <w:pPr>
-              <w:spacing w:before="0" w:after="0"/>
-              <w:jc w:val="center"/>
-            </w:pPr>
-            <w:r>
-              <w:rPr>
-                <w:rFonts w:ascii="Times New Roman" w:hAnsi="Times New Roman"/>
-                <w:b/>
-                <w:sz w:val="20"/>
-              </w:rPr>
-              <w:t>SKILL CHECK 2</w:t>
-            </w:r>
-          </w:p>
-          <w:p>
-            <w:pPr>
-              <w:spacing w:before="0" w:after="120"/>
-              <w:jc w:val="center"/>
-            </w:pPr>
-            <w:r>
-              <w:rPr>
-                <w:rFonts w:ascii="Times New Roman" w:hAnsi="Times New Roman"/>
-                <w:sz w:val="20"/>
-              </w:rPr>
-              <w:t>Physics 1</w:t>
-            </w:r>
-          </w:p>
-          <w:p>
-            <w:pPr>
-              <w:spacing w:before="0" w:after="120"/>
-            </w:pPr>
-            <w:r>
-              <w:rPr>
-                <w:rFonts w:ascii="Times New Roman" w:hAnsi="Times New Roman"/>
-                <w:b/>
-                <w:sz w:val="20"/>
-              </w:rPr>
-              <w:t>Instructions:</w:t>
-            </w:r>
-            <w:r>
-              <w:rPr>
-                <w:rFonts w:ascii="Times New Roman" w:hAnsi="Times New Roman"/>
-                <w:sz w:val="20"/>
-              </w:rPr>
-              <w:t xml:space="preserve"> Do not write anything on this paper. Solve the problems using the Given-Required-Solution format. Show the isolation of the target variable before substituting any numerical values.</w:t>
-            </w:r>
-          </w:p>
-          <w:p>
-            <w:pPr>
-              <w:spacing w:before="0" w:after="120"/>
-            </w:pPr>
-            <w:r>
-              <w:rPr>
-                <w:rFonts w:ascii="Times New Roman" w:hAnsi="Times New Roman"/>
-                <w:sz w:val="20"/>
-              </w:rPr>
-              <w:t>1) A jet plane is cruising at 280 m/s when suddenly the pilot turns the engines to full throttle. After traveling 4.0 km, the jet moves with a speed of 380 m/s. What is the jet’s acceleration, assuming it to be a constant acceleration? [5 pts]</w:t>
-            </w:r>
-          </w:p>
-          <w:p>
-            <w:pPr>
-              <w:spacing w:before="0" w:after="0"/>
-            </w:pPr>
-            <w:r>
-              <w:rPr>
-                <w:rFonts w:ascii="Times New Roman" w:hAnsi="Times New Roman"/>
-                <w:sz w:val="20"/>
-              </w:rPr>
-              <w:t>2) How long, in seconds, does it take for the air in your lungs to accelerate from rest to 150 km/h, assuming a constant acceleration of 83 m/s²? [5 pts]</w:t>
-            </w:r>
-          </w:p>
-        </w:tc>
-      </w:tr>
-      <w:tr>
-        <w:tc>
-          <w:tcPr>
-            <w:tcW w:type="dxa" w:w="11674"/>
-            <w:tcMar>
-              <w:top w:w="80" w:type="dxa"/>
-              <w:bottom w:w="80" w:type="dxa"/>
-              <w:start w:w="120" w:type="dxa"/>
-              <w:end w:w="120" w:type="dxa"/>
-            </w:tcMar>
-          </w:tcPr>
-          <w:p>
-            <w:pPr>
-              <w:spacing w:before="0" w:after="0"/>
-              <w:jc w:val="right"/>
-            </w:pPr>
-            <w:r>
-              <w:rPr>
-                <w:rFonts w:ascii="Times New Roman" w:hAnsi="Times New Roman"/>
-                <w:sz w:val="20"/>
-              </w:rPr>
-              <w:t>Questionnaire No. PHYS1-SC2-47</w:t>
-            </w:r>
-          </w:p>
-          <w:p>
-            <w:pPr>
-              <w:spacing w:before="0" w:after="0"/>
-              <w:jc w:val="center"/>
-            </w:pPr>
-            <w:r>
-              <w:rPr>
-                <w:rFonts w:ascii="Times New Roman" w:hAnsi="Times New Roman"/>
-                <w:b/>
-                <w:sz w:val="20"/>
-              </w:rPr>
-              <w:t>SKILL CHECK 2</w:t>
-            </w:r>
-          </w:p>
-          <w:p>
-            <w:pPr>
-              <w:spacing w:before="0" w:after="120"/>
-              <w:jc w:val="center"/>
-            </w:pPr>
-            <w:r>
-              <w:rPr>
-                <w:rFonts w:ascii="Times New Roman" w:hAnsi="Times New Roman"/>
-                <w:sz w:val="20"/>
-              </w:rPr>
-              <w:t>Physics 1</w:t>
-            </w:r>
-          </w:p>
-          <w:p>
-            <w:pPr>
-              <w:spacing w:before="0" w:after="120"/>
-            </w:pPr>
-            <w:r>
-              <w:rPr>
-                <w:rFonts w:ascii="Times New Roman" w:hAnsi="Times New Roman"/>
-                <w:b/>
-                <w:sz w:val="20"/>
-              </w:rPr>
-              <w:t>Instructions:</w:t>
-            </w:r>
-            <w:r>
-              <w:rPr>
-                <w:rFonts w:ascii="Times New Roman" w:hAnsi="Times New Roman"/>
-                <w:sz w:val="20"/>
-              </w:rPr>
-              <w:t xml:space="preserve"> Do not write anything on this paper. Solve the problems using the Given-Required-Solution format. Show the isolation of the target variable before substituting any numerical values.</w:t>
-            </w:r>
-          </w:p>
-          <w:p>
-            <w:pPr>
-              <w:spacing w:before="0" w:after="120"/>
-            </w:pPr>
-            <w:r>
-              <w:rPr>
-                <w:rFonts w:ascii="Times New Roman" w:hAnsi="Times New Roman"/>
-                <w:sz w:val="20"/>
-              </w:rPr>
-              <w:t>1) A jet plane is cruising at 280 m/s when suddenly the pilot turns the engines to full throttle. After traveling 4.0 km, the jet moves with a speed of 380 m/s. What is the jet’s acceleration, assuming it to be a constant acceleration? [5 pts]</w:t>
-            </w:r>
-          </w:p>
-          <w:p>
-            <w:pPr>
-              <w:spacing w:before="0" w:after="0"/>
-            </w:pPr>
-            <w:r>
-              <w:rPr>
-                <w:rFonts w:ascii="Times New Roman" w:hAnsi="Times New Roman"/>
-                <w:sz w:val="20"/>
-              </w:rPr>
-              <w:t>2) How long, in seconds, does it take for the air in your lungs to accelerate from rest to 150 km/h, assuming a constant acceleration of 83 m/s²? [5 pts]</w:t>
-            </w:r>
-          </w:p>
-        </w:tc>
-      </w:tr>
-      <w:tr>
-        <w:tc>
-          <w:tcPr>
-            <w:tcW w:type="dxa" w:w="11674"/>
+            <w:tcW w:type="dxa" w:w="5760"/>
             <w:tcMar>
               <w:top w:w="80" w:type="dxa"/>
               <w:bottom w:w="80" w:type="dxa"/>

</xml_diff>